<commit_message>
Update data files, scripts, and notebook
Modified binary data files (Data/Clean/base_indices.dta, tabla_indices.xlsx, tabla_indices_mapas.xlsx) and updated document Guion_Audiovisual_Mediterraneos_v2.docx. Enhanced Scripts/09_Construccion_Indices.do with simple summary loops and tabulations for diagnostics. Updated Scripts/10_script_generacion_graficos.ipynb: fixed local paths to user 'anton', added a pip install hint, normalized execution counts/outputs, added a new IDL (Indice de Digitalizacion Local) summary block (general, by hot_zone, and gap calculation), and adjusted notebook metadata. Removed temporary swap file Scripts/~08_Construccion_Base_Datos..do.stswp.
</commit_message>
<xml_diff>
--- a/Documentos/Guion_Audiovisual_Mediterraneos_v2.docx
+++ b/Documentos/Guion_Audiovisual_Mediterraneos_v2.docx
@@ -59,25 +59,7 @@
           <w:sz w:val="20"/>
           <w:szCs w:val="20"/>
         </w:rPr>
-        <w:t xml:space="preserve">Duración estimada: 6 min 10 </w:t>
-      </w:r>
-      <w:proofErr w:type="spellStart"/>
-      <w:r>
-        <w:rPr>
-          <w:color w:val="777777"/>
-          <w:sz w:val="20"/>
-          <w:szCs w:val="20"/>
-        </w:rPr>
-        <w:t>seg</w:t>
-      </w:r>
-      <w:proofErr w:type="spellEnd"/>
-      <w:r>
-        <w:rPr>
-          <w:color w:val="777777"/>
-          <w:sz w:val="20"/>
-          <w:szCs w:val="20"/>
-        </w:rPr>
-        <w:t xml:space="preserve">  ·  Audiencia: evaluadores académicos  ·  Formato: producción audiovisual con narrador</w:t>
+        <w:t>Duración estimada: 6 min 10 seg  ·  Audiencia: evaluadores académicos  ·  Formato: producción audiovisual con narrador</w:t>
       </w:r>
     </w:p>
     <w:p>
@@ -87,7 +69,7 @@
     </w:p>
     <w:p>
       <w:pPr>
-        <w:pStyle w:val="Ttulo1"/>
+        <w:pStyle w:val="Heading1"/>
       </w:pPr>
       <w:r>
         <w:t>Instrucciones de uso del guion</w:t>
@@ -133,7 +115,7 @@
     </w:p>
     <w:p>
       <w:pPr>
-        <w:pStyle w:val="Prrafodelista"/>
+        <w:pStyle w:val="ListParagraph"/>
         <w:numPr>
           <w:ilvl w:val="0"/>
           <w:numId w:val="2"/>
@@ -150,7 +132,7 @@
     </w:p>
     <w:p>
       <w:pPr>
-        <w:pStyle w:val="Prrafodelista"/>
+        <w:pStyle w:val="ListParagraph"/>
         <w:numPr>
           <w:ilvl w:val="0"/>
           <w:numId w:val="2"/>
@@ -167,7 +149,7 @@
     </w:p>
     <w:p>
       <w:pPr>
-        <w:pStyle w:val="Prrafodelista"/>
+        <w:pStyle w:val="ListParagraph"/>
         <w:numPr>
           <w:ilvl w:val="0"/>
           <w:numId w:val="2"/>
@@ -184,7 +166,7 @@
     </w:p>
     <w:p>
       <w:pPr>
-        <w:pStyle w:val="Prrafodelista"/>
+        <w:pStyle w:val="ListParagraph"/>
         <w:numPr>
           <w:ilvl w:val="0"/>
           <w:numId w:val="2"/>
@@ -206,7 +188,7 @@
     </w:p>
     <w:p>
       <w:pPr>
-        <w:pStyle w:val="Ttulo1"/>
+        <w:pStyle w:val="Heading1"/>
       </w:pPr>
       <w:r>
         <w:t>Estructura del video — Mapa de escenas</w:t>
@@ -884,23 +866,7 @@
                 <w:sz w:val="20"/>
                 <w:szCs w:val="20"/>
               </w:rPr>
-              <w:t xml:space="preserve">Índice de </w:t>
-            </w:r>
-            <w:proofErr w:type="spellStart"/>
-            <w:r>
-              <w:rPr>
-                <w:sz w:val="20"/>
-                <w:szCs w:val="20"/>
-              </w:rPr>
-              <w:t>Delivery</w:t>
-            </w:r>
-            <w:proofErr w:type="spellEnd"/>
-            <w:r>
-              <w:rPr>
-                <w:sz w:val="20"/>
-                <w:szCs w:val="20"/>
-              </w:rPr>
-              <w:t xml:space="preserve"> (IDL): canal de venta, datos y dependencia</w:t>
+              <w:t>Índice de Delivery (IDL): canal de venta, datos y dependencia</w:t>
             </w:r>
           </w:p>
         </w:tc>
@@ -1189,7 +1155,7 @@
     </w:p>
     <w:p>
       <w:pPr>
-        <w:pStyle w:val="Ttulo1"/>
+        <w:pStyle w:val="Heading1"/>
       </w:pPr>
       <w:r>
         <w:t>Guion detallado por escenas</w:t>
@@ -1334,23 +1300,7 @@
                 <w:sz w:val="21"/>
                 <w:szCs w:val="21"/>
               </w:rPr>
-              <w:t xml:space="preserve">Imagina tener una gran receta de **mariscos, pasta o </w:t>
-            </w:r>
-            <w:proofErr w:type="spellStart"/>
-            <w:r>
-              <w:rPr>
-                <w:sz w:val="21"/>
-                <w:szCs w:val="21"/>
-              </w:rPr>
-              <w:t>gyros</w:t>
-            </w:r>
-            <w:proofErr w:type="spellEnd"/>
-            <w:r>
-              <w:rPr>
-                <w:sz w:val="21"/>
-                <w:szCs w:val="21"/>
-              </w:rPr>
-              <w:t>**, un buen local y una propuesta auténtica… pero que aun así las mesas no se llenen.</w:t>
+              <w:t>Imagina tener una gran receta de **mariscos, pasta o gyros**, un buen local y una propuesta auténtica… pero que aun así las mesas no se llenen.</w:t>
             </w:r>
           </w:p>
           <w:p>
@@ -1404,66 +1354,34 @@
                 <w:sz w:val="21"/>
                 <w:szCs w:val="21"/>
               </w:rPr>
-              <w:t xml:space="preserve">En Bogotá, muchos consumidores eligen dónde comer desde una pantalla: revisan reseñas, comparan fotos, miran redes sociales y buscan opciones en apps de </w:t>
-            </w:r>
-            <w:proofErr w:type="spellStart"/>
-            <w:r>
-              <w:rPr>
-                <w:sz w:val="21"/>
-                <w:szCs w:val="21"/>
-              </w:rPr>
-              <w:t>delivery</w:t>
-            </w:r>
-            <w:proofErr w:type="spellEnd"/>
-            <w:r>
-              <w:rPr>
-                <w:sz w:val="21"/>
-                <w:szCs w:val="21"/>
-              </w:rPr>
-              <w:t>. En ese contexto, un restaurante sin presencia digital puede volverse invisible.</w:t>
-            </w:r>
-          </w:p>
-          <w:p>
-            <w:pPr>
-              <w:spacing w:line="320" w:lineRule="auto"/>
-              <w:jc w:val="both"/>
-              <w:rPr>
-                <w:sz w:val="21"/>
-                <w:szCs w:val="21"/>
-              </w:rPr>
-            </w:pPr>
-          </w:p>
-          <w:p>
-            <w:pPr>
-              <w:spacing w:line="320" w:lineRule="auto"/>
-              <w:jc w:val="both"/>
-              <w:rPr>
-                <w:sz w:val="21"/>
-                <w:szCs w:val="21"/>
-              </w:rPr>
-            </w:pPr>
-            <w:r>
-              <w:rPr>
-                <w:sz w:val="21"/>
-                <w:szCs w:val="21"/>
-              </w:rPr>
-              <w:t xml:space="preserve">Por eso, encuestamos a **35 restaurantes mediterráneos en Bogotá** para evaluar su posicionamiento digital en tres frentes: **redes sociales, plataformas de </w:t>
-            </w:r>
-            <w:proofErr w:type="spellStart"/>
-            <w:r>
-              <w:rPr>
-                <w:sz w:val="21"/>
-                <w:szCs w:val="21"/>
-              </w:rPr>
-              <w:t>delivery</w:t>
-            </w:r>
-            <w:proofErr w:type="spellEnd"/>
-            <w:r>
-              <w:rPr>
-                <w:sz w:val="21"/>
-                <w:szCs w:val="21"/>
-              </w:rPr>
-              <w:t xml:space="preserve"> y plataformas de opinión**. También analizamos cómo perciben la inteligencia artificial como herramienta para competir en el futuro.</w:t>
+              <w:t>En Bogotá, muchos consumidores eligen dónde comer desde una pantalla: revisan reseñas, comparan fotos, miran redes sociales y buscan opciones en apps de delivery. En ese contexto, un restaurante sin presencia digital puede volverse invisible.</w:t>
+            </w:r>
+          </w:p>
+          <w:p>
+            <w:pPr>
+              <w:spacing w:line="320" w:lineRule="auto"/>
+              <w:jc w:val="both"/>
+              <w:rPr>
+                <w:sz w:val="21"/>
+                <w:szCs w:val="21"/>
+              </w:rPr>
+            </w:pPr>
+          </w:p>
+          <w:p>
+            <w:pPr>
+              <w:spacing w:line="320" w:lineRule="auto"/>
+              <w:jc w:val="both"/>
+              <w:rPr>
+                <w:sz w:val="21"/>
+                <w:szCs w:val="21"/>
+              </w:rPr>
+            </w:pPr>
+            <w:r>
+              <w:rPr>
+                <w:sz w:val="21"/>
+                <w:szCs w:val="21"/>
+              </w:rPr>
+              <w:t>Por eso, encuestamos a **35 restaurantes mediterráneos en Bogotá** para evaluar su posicionamiento digital en tres frentes: **redes sociales, plataformas de delivery y plataformas de opinión**. También analizamos cómo perciben la inteligencia artificial como herramienta para competir en el futuro.</w:t>
             </w:r>
           </w:p>
           <w:p>
@@ -1837,23 +1755,7 @@
                 <w:sz w:val="21"/>
                 <w:szCs w:val="21"/>
               </w:rPr>
-              <w:t>Según (</w:t>
-            </w:r>
-            <w:proofErr w:type="spellStart"/>
-            <w:r>
-              <w:rPr>
-                <w:sz w:val="21"/>
-                <w:szCs w:val="21"/>
-              </w:rPr>
-              <w:t>Digisap</w:t>
-            </w:r>
-            <w:proofErr w:type="spellEnd"/>
-            <w:r>
-              <w:rPr>
-                <w:sz w:val="21"/>
-                <w:szCs w:val="21"/>
-              </w:rPr>
-              <w:t>, 2025) El 92% de los consumidores colombianos investiga en línea antes de elegir restaurante. Y el 78% prefiere reservar a través de plataformas digitales.</w:t>
+              <w:t>Según (Digisap, 2025) El 92% de los consumidores colombianos investiga en línea antes de elegir restaurante. Y el 78% prefiere reservar a través de plataformas digitales.</w:t>
             </w:r>
             <w:r>
               <w:rPr>
@@ -1958,23 +1860,7 @@
                 <w:sz w:val="21"/>
                 <w:szCs w:val="21"/>
               </w:rPr>
-              <w:t xml:space="preserve">Animación de línea de tiempo dividida en dos momentos: 'Antes' (íconos de ubicación, voz a voz, anuncio en periódico) → 'Hoy' (íconos de Google </w:t>
-            </w:r>
-            <w:proofErr w:type="spellStart"/>
-            <w:r>
-              <w:rPr>
-                <w:sz w:val="21"/>
-                <w:szCs w:val="21"/>
-              </w:rPr>
-              <w:t>Maps</w:t>
-            </w:r>
-            <w:proofErr w:type="spellEnd"/>
-            <w:r>
-              <w:rPr>
-                <w:sz w:val="21"/>
-                <w:szCs w:val="21"/>
-              </w:rPr>
-              <w:t xml:space="preserve">, Instagram, TikTok, reseñas). En el centro, una figura humana con teléfono. Siguiente plano: mapa estilizado de Bogotá con </w:t>
+              <w:t xml:space="preserve">Animación de línea de tiempo dividida en dos momentos: 'Antes' (íconos de ubicación, voz a voz, anuncio en periódico) → 'Hoy' (íconos de Google Maps, Instagram, TikTok, reseñas). En el centro, una figura humana con teléfono. Siguiente plano: mapa estilizado de Bogotá con </w:t>
             </w:r>
             <w:r>
               <w:rPr>
@@ -1997,23 +1883,13 @@
               </w:rPr>
               <w:t xml:space="preserve"> Fuente (</w:t>
             </w:r>
-            <w:proofErr w:type="spellStart"/>
             <w:r>
               <w:rPr>
                 <w:color w:val="1A1A1A"/>
                 <w:sz w:val="20"/>
                 <w:szCs w:val="20"/>
               </w:rPr>
-              <w:t>Digisap</w:t>
-            </w:r>
-            <w:proofErr w:type="spellEnd"/>
-            <w:r>
-              <w:rPr>
-                <w:color w:val="1A1A1A"/>
-                <w:sz w:val="20"/>
-                <w:szCs w:val="20"/>
-              </w:rPr>
-              <w:t xml:space="preserve">, 2025) </w:t>
+              <w:t xml:space="preserve">Digisap, 2025) </w:t>
             </w:r>
             <w:r>
               <w:rPr>
@@ -2080,69 +1956,12 @@
               <w:spacing w:line="320" w:lineRule="auto"/>
               <w:jc w:val="both"/>
             </w:pPr>
-            <w:proofErr w:type="spellStart"/>
-            <w:r>
-              <w:rPr>
-                <w:sz w:val="21"/>
-                <w:szCs w:val="21"/>
-              </w:rPr>
-              <w:t>Motion</w:t>
-            </w:r>
-            <w:proofErr w:type="spellEnd"/>
-            <w:r>
-              <w:rPr>
-                <w:sz w:val="21"/>
-                <w:szCs w:val="21"/>
-              </w:rPr>
-              <w:t xml:space="preserve"> </w:t>
-            </w:r>
-            <w:proofErr w:type="spellStart"/>
-            <w:r>
-              <w:rPr>
-                <w:sz w:val="21"/>
-                <w:szCs w:val="21"/>
-              </w:rPr>
-              <w:t>graphics</w:t>
-            </w:r>
-            <w:proofErr w:type="spellEnd"/>
-            <w:r>
-              <w:rPr>
-                <w:sz w:val="21"/>
-                <w:szCs w:val="21"/>
-              </w:rPr>
-              <w:t xml:space="preserve"> de línea de tiempo + mapa de puntos animado de Bogotá + estadísticas tipo </w:t>
-            </w:r>
-            <w:proofErr w:type="spellStart"/>
-            <w:r>
-              <w:rPr>
-                <w:sz w:val="21"/>
-                <w:szCs w:val="21"/>
-              </w:rPr>
-              <w:t>kinetic</w:t>
-            </w:r>
-            <w:proofErr w:type="spellEnd"/>
-            <w:r>
-              <w:rPr>
-                <w:sz w:val="21"/>
-                <w:szCs w:val="21"/>
-              </w:rPr>
-              <w:t xml:space="preserve"> </w:t>
-            </w:r>
-            <w:proofErr w:type="spellStart"/>
-            <w:r>
-              <w:rPr>
-                <w:sz w:val="21"/>
-                <w:szCs w:val="21"/>
-              </w:rPr>
-              <w:t>typography</w:t>
-            </w:r>
-            <w:proofErr w:type="spellEnd"/>
-            <w:r>
-              <w:rPr>
-                <w:sz w:val="21"/>
-                <w:szCs w:val="21"/>
-              </w:rPr>
-              <w:t>.</w:t>
+            <w:r>
+              <w:rPr>
+                <w:sz w:val="21"/>
+                <w:szCs w:val="21"/>
+              </w:rPr>
+              <w:t>Motion graphics de línea de tiempo + mapa de puntos animado de Bogotá + estadísticas tipo kinetic typography.</w:t>
             </w:r>
           </w:p>
         </w:tc>
@@ -2411,27 +2230,7 @@
                 <w:sz w:val="21"/>
                 <w:szCs w:val="21"/>
               </w:rPr>
-              <w:t xml:space="preserve">Índice de </w:t>
-            </w:r>
-            <w:proofErr w:type="spellStart"/>
-            <w:r>
-              <w:rPr>
-                <w:b/>
-                <w:bCs/>
-                <w:sz w:val="21"/>
-                <w:szCs w:val="21"/>
-              </w:rPr>
-              <w:t>Delivery</w:t>
-            </w:r>
-            <w:proofErr w:type="spellEnd"/>
-            <w:r>
-              <w:rPr>
-                <w:b/>
-                <w:bCs/>
-                <w:sz w:val="21"/>
-                <w:szCs w:val="21"/>
-              </w:rPr>
-              <w:t xml:space="preserve"> </w:t>
+              <w:t xml:space="preserve">Índice de Delivery </w:t>
             </w:r>
             <w:r>
               <w:rPr>
@@ -2448,39 +2247,7 @@
                 <w:sz w:val="21"/>
                 <w:szCs w:val="21"/>
               </w:rPr>
-              <w:t xml:space="preserve">, que captura qué tanto se integran a plataformas como </w:t>
-            </w:r>
-            <w:proofErr w:type="spellStart"/>
-            <w:r>
-              <w:rPr>
-                <w:sz w:val="21"/>
-                <w:szCs w:val="21"/>
-              </w:rPr>
-              <w:t>Rappi</w:t>
-            </w:r>
-            <w:proofErr w:type="spellEnd"/>
-            <w:r>
-              <w:rPr>
-                <w:sz w:val="21"/>
-                <w:szCs w:val="21"/>
-              </w:rPr>
-              <w:t xml:space="preserve"> o </w:t>
-            </w:r>
-            <w:proofErr w:type="spellStart"/>
-            <w:r>
-              <w:rPr>
-                <w:sz w:val="21"/>
-                <w:szCs w:val="21"/>
-              </w:rPr>
-              <w:t>DiDi</w:t>
-            </w:r>
-            <w:proofErr w:type="spellEnd"/>
-            <w:r>
-              <w:rPr>
-                <w:sz w:val="21"/>
-                <w:szCs w:val="21"/>
-              </w:rPr>
-              <w:t xml:space="preserve">, no solo para vender, sino también para usar información sobre sus clientes. Y tercero, el </w:t>
+              <w:t xml:space="preserve">, que captura qué tanto se integran a plataformas como Rappi o DiDi, no solo para vender, sino también para usar información sobre sus clientes. Y tercero, el </w:t>
             </w:r>
             <w:r>
               <w:rPr>
@@ -2496,23 +2263,7 @@
                 <w:sz w:val="21"/>
                 <w:szCs w:val="21"/>
               </w:rPr>
-              <w:t xml:space="preserve">, que evalúa su reputación en espacios como Google </w:t>
-            </w:r>
-            <w:proofErr w:type="spellStart"/>
-            <w:r>
-              <w:rPr>
-                <w:sz w:val="21"/>
-                <w:szCs w:val="21"/>
-              </w:rPr>
-              <w:t>Maps</w:t>
-            </w:r>
-            <w:proofErr w:type="spellEnd"/>
-            <w:r>
-              <w:rPr>
-                <w:sz w:val="21"/>
-                <w:szCs w:val="21"/>
-              </w:rPr>
-              <w:t xml:space="preserve"> y TripAdvisor, considerando reseñas, calificaciones y presencia activa.</w:t>
+              <w:t>, que evalúa su reputación en espacios como Google Maps y TripAdvisor, considerando reseñas, calificaciones y presencia activa.</w:t>
             </w:r>
           </w:p>
           <w:p>
@@ -2536,33 +2287,8 @@
                 <w:sz w:val="21"/>
                 <w:szCs w:val="21"/>
               </w:rPr>
-              <w:t xml:space="preserve">un </w:t>
-            </w:r>
-            <w:proofErr w:type="spellStart"/>
-            <w:r>
-              <w:rPr>
-                <w:sz w:val="21"/>
-                <w:szCs w:val="21"/>
-              </w:rPr>
-              <w:t>game</w:t>
-            </w:r>
-            <w:proofErr w:type="spellEnd"/>
-            <w:r>
-              <w:rPr>
-                <w:sz w:val="21"/>
-                <w:szCs w:val="21"/>
-              </w:rPr>
-              <w:t xml:space="preserve"> </w:t>
-            </w:r>
-            <w:proofErr w:type="spellStart"/>
-            <w:r>
-              <w:rPr>
-                <w:sz w:val="21"/>
-                <w:szCs w:val="21"/>
-              </w:rPr>
-              <w:t>changer</w:t>
-            </w:r>
-            <w:proofErr w:type="spellEnd"/>
+              <w:t>un game changer</w:t>
+            </w:r>
             <w:r>
               <w:rPr>
                 <w:sz w:val="21"/>
@@ -2634,71 +2360,7 @@
                 <w:sz w:val="21"/>
                 <w:szCs w:val="21"/>
               </w:rPr>
-              <w:t xml:space="preserve">Tres bloques aparecen en pantalla de forma progresiva, cada uno con su ícono, nombre y rango de puntuación: 📱 IRS — Redes Sociales  (0 a 14 </w:t>
-            </w:r>
-            <w:proofErr w:type="spellStart"/>
-            <w:r>
-              <w:rPr>
-                <w:sz w:val="21"/>
-                <w:szCs w:val="21"/>
-              </w:rPr>
-              <w:t>pts</w:t>
-            </w:r>
-            <w:proofErr w:type="spellEnd"/>
-            <w:r>
-              <w:rPr>
-                <w:sz w:val="21"/>
-                <w:szCs w:val="21"/>
-              </w:rPr>
-              <w:t xml:space="preserve">)  |  Bajo: 0–4  ·  Medio: 5–9  ·  Alto: 10–14 🛵 IDL — </w:t>
-            </w:r>
-            <w:proofErr w:type="spellStart"/>
-            <w:r>
-              <w:rPr>
-                <w:sz w:val="21"/>
-                <w:szCs w:val="21"/>
-              </w:rPr>
-              <w:t>Delivery</w:t>
-            </w:r>
-            <w:proofErr w:type="spellEnd"/>
-            <w:r>
-              <w:rPr>
-                <w:sz w:val="21"/>
-                <w:szCs w:val="21"/>
-              </w:rPr>
-              <w:t xml:space="preserve">  (0 a 10 </w:t>
-            </w:r>
-            <w:proofErr w:type="spellStart"/>
-            <w:r>
-              <w:rPr>
-                <w:sz w:val="21"/>
-                <w:szCs w:val="21"/>
-              </w:rPr>
-              <w:t>pts</w:t>
-            </w:r>
-            <w:proofErr w:type="spellEnd"/>
-            <w:r>
-              <w:rPr>
-                <w:sz w:val="21"/>
-                <w:szCs w:val="21"/>
-              </w:rPr>
-              <w:t xml:space="preserve">)  |  Bajo: 0–3  ·  Medio: 4–6  ·  Alto: 7–10 ⭐ IPO — Opinión  (0 a 18 </w:t>
-            </w:r>
-            <w:proofErr w:type="spellStart"/>
-            <w:r>
-              <w:rPr>
-                <w:sz w:val="21"/>
-                <w:szCs w:val="21"/>
-              </w:rPr>
-              <w:t>pts</w:t>
-            </w:r>
-            <w:proofErr w:type="spellEnd"/>
-            <w:r>
-              <w:rPr>
-                <w:sz w:val="21"/>
-                <w:szCs w:val="21"/>
-              </w:rPr>
-              <w:t>)  |  Bajo: 0–5  ·  Medio: 6–11  ·  Alto: 12–18 Debajo, una línea de texto: 'Tres índices. Una pregunta: ¿cuál transforma más el posicionamiento?'</w:t>
+              <w:t>Tres bloques aparecen en pantalla de forma progresiva, cada uno con su ícono, nombre y rango de puntuación: 📱 IRS — Redes Sociales  (0 a 14 pts)  |  Bajo: 0–4  ·  Medio: 5–9  ·  Alto: 10–14 🛵 IDL — Delivery  (0 a 10 pts)  |  Bajo: 0–3  ·  Medio: 4–6  ·  Alto: 7–10 ⭐ IPO — Opinión  (0 a 18 pts)  |  Bajo: 0–5  ·  Medio: 6–11  ·  Alto: 12–18 Debajo, una línea de texto: 'Tres índices. Una pregunta: ¿cuál transforma más el posicionamiento?'</w:t>
             </w:r>
           </w:p>
         </w:tc>
@@ -3000,66 +2662,34 @@
                 <w:sz w:val="21"/>
                 <w:szCs w:val="21"/>
               </w:rPr>
-              <w:t xml:space="preserve">A cada uno le preguntamos por temas clave para entender su posicionamiento digital: cómo usan redes sociales, cuánto invierten en marketing, qué tanto dependen de canales como el local físico, el </w:t>
-            </w:r>
-            <w:proofErr w:type="spellStart"/>
-            <w:r>
-              <w:rPr>
-                <w:sz w:val="21"/>
-                <w:szCs w:val="21"/>
-              </w:rPr>
-              <w:t>delivery</w:t>
-            </w:r>
-            <w:proofErr w:type="spellEnd"/>
-            <w:r>
-              <w:rPr>
-                <w:sz w:val="21"/>
-                <w:szCs w:val="21"/>
-              </w:rPr>
-              <w:t xml:space="preserve"> o las plataformas digitales, cómo gestionan sus reseñas en internet y qué tan cerca —o lejos— se sienten de adoptar herramientas de inteligencia artificial.</w:t>
-            </w:r>
-          </w:p>
-          <w:p>
-            <w:pPr>
-              <w:spacing w:line="320" w:lineRule="auto"/>
-              <w:jc w:val="both"/>
-              <w:rPr>
-                <w:sz w:val="21"/>
-                <w:szCs w:val="21"/>
-              </w:rPr>
-            </w:pPr>
-          </w:p>
-          <w:p>
-            <w:pPr>
-              <w:spacing w:line="320" w:lineRule="auto"/>
-              <w:jc w:val="both"/>
-              <w:rPr>
-                <w:sz w:val="21"/>
-                <w:szCs w:val="21"/>
-              </w:rPr>
-            </w:pPr>
-            <w:r>
-              <w:rPr>
-                <w:sz w:val="21"/>
-                <w:szCs w:val="21"/>
-              </w:rPr>
-              <w:t xml:space="preserve">Pero no nos quedamos únicamente con lo que los restaurantes nos contaron. También observamos su presencia real en plataformas como Google </w:t>
-            </w:r>
-            <w:proofErr w:type="spellStart"/>
-            <w:r>
-              <w:rPr>
-                <w:sz w:val="21"/>
-                <w:szCs w:val="21"/>
-              </w:rPr>
-              <w:t>Maps</w:t>
-            </w:r>
-            <w:proofErr w:type="spellEnd"/>
-            <w:r>
-              <w:rPr>
-                <w:sz w:val="21"/>
-                <w:szCs w:val="21"/>
-              </w:rPr>
-              <w:t xml:space="preserve"> y TripAdvisor, revisando variables como número de reseñas, calificación promedio y nivel de actividad digital.</w:t>
+              <w:t>A cada uno le preguntamos por temas clave para entender su posicionamiento digital: cómo usan redes sociales, cuánto invierten en marketing, qué tanto dependen de canales como el local físico, el delivery o las plataformas digitales, cómo gestionan sus reseñas en internet y qué tan cerca —o lejos— se sienten de adoptar herramientas de inteligencia artificial.</w:t>
+            </w:r>
+          </w:p>
+          <w:p>
+            <w:pPr>
+              <w:spacing w:line="320" w:lineRule="auto"/>
+              <w:jc w:val="both"/>
+              <w:rPr>
+                <w:sz w:val="21"/>
+                <w:szCs w:val="21"/>
+              </w:rPr>
+            </w:pPr>
+          </w:p>
+          <w:p>
+            <w:pPr>
+              <w:spacing w:line="320" w:lineRule="auto"/>
+              <w:jc w:val="both"/>
+              <w:rPr>
+                <w:sz w:val="21"/>
+                <w:szCs w:val="21"/>
+              </w:rPr>
+            </w:pPr>
+            <w:r>
+              <w:rPr>
+                <w:sz w:val="21"/>
+                <w:szCs w:val="21"/>
+              </w:rPr>
+              <w:t>Pero no nos quedamos únicamente con lo que los restaurantes nos contaron. También observamos su presencia real en plataformas como Google Maps y TripAdvisor, revisando variables como número de reseñas, calificación promedio y nivel de actividad digital.</w:t>
             </w:r>
           </w:p>
           <w:p>
@@ -3250,39 +2880,7 @@
                 <w:sz w:val="21"/>
                 <w:szCs w:val="21"/>
               </w:rPr>
-              <w:t xml:space="preserve">%. Imagen de encuestador frente a restaurante con </w:t>
-            </w:r>
-            <w:proofErr w:type="spellStart"/>
-            <w:r>
-              <w:rPr>
-                <w:sz w:val="21"/>
-                <w:szCs w:val="21"/>
-              </w:rPr>
-              <w:t>tablet</w:t>
-            </w:r>
-            <w:proofErr w:type="spellEnd"/>
-            <w:r>
-              <w:rPr>
-                <w:sz w:val="21"/>
-                <w:szCs w:val="21"/>
-              </w:rPr>
-              <w:t xml:space="preserve">. Iconos de Google </w:t>
-            </w:r>
-            <w:proofErr w:type="spellStart"/>
-            <w:r>
-              <w:rPr>
-                <w:sz w:val="21"/>
-                <w:szCs w:val="21"/>
-              </w:rPr>
-              <w:t>Maps</w:t>
-            </w:r>
-            <w:proofErr w:type="spellEnd"/>
-            <w:r>
-              <w:rPr>
-                <w:sz w:val="21"/>
-                <w:szCs w:val="21"/>
-              </w:rPr>
-              <w:t xml:space="preserve"> + TripAdvisor con la leyenda 'datos observacionales directos'. Diagrama de dos columnas: columna izquierda = datos declarados (encuesta); columna derecha = datos observados (plataformas). Flecha central: 'Índices de digitalización'.</w:t>
+              <w:t>%. Imagen de encuestador frente a restaurante con tablet. Iconos de Google Maps + TripAdvisor con la leyenda 'datos observacionales directos'. Diagrama de dos columnas: columna izquierda = datos declarados (encuesta); columna derecha = datos observados (plataformas). Flecha central: 'Índices de digitalización'.</w:t>
             </w:r>
           </w:p>
         </w:tc>
@@ -3678,87 +3276,73 @@
                 <w:sz w:val="21"/>
                 <w:szCs w:val="21"/>
               </w:rPr>
-              <w:t>[DATO]%</w:t>
-            </w:r>
-            <w:r>
-              <w:rPr>
-                <w:sz w:val="21"/>
-                <w:szCs w:val="21"/>
-              </w:rPr>
-              <w:t xml:space="preserve"> de los restaurantes declara invertir activamente en marketing digital. Las plataformas más usadas son </w:t>
-            </w:r>
-            <w:r>
-              <w:rPr>
-                <w:b/>
-                <w:bCs/>
-                <w:sz w:val="21"/>
-                <w:szCs w:val="21"/>
-              </w:rPr>
-              <w:t>[DATO]</w:t>
-            </w:r>
-            <w:r>
-              <w:rPr>
-                <w:sz w:val="21"/>
-                <w:szCs w:val="21"/>
-              </w:rPr>
-              <w:t xml:space="preserve">, </w:t>
-            </w:r>
-            <w:r>
-              <w:rPr>
-                <w:b/>
-                <w:bCs/>
-                <w:sz w:val="21"/>
-                <w:szCs w:val="21"/>
-              </w:rPr>
-              <w:t>[DATO]</w:t>
-            </w:r>
-            <w:r>
-              <w:rPr>
-                <w:sz w:val="21"/>
-                <w:szCs w:val="21"/>
-              </w:rPr>
-              <w:t xml:space="preserve"> y </w:t>
-            </w:r>
-            <w:r>
-              <w:rPr>
-                <w:b/>
-                <w:bCs/>
-                <w:sz w:val="21"/>
-                <w:szCs w:val="21"/>
-              </w:rPr>
-              <w:t>[DATO]</w:t>
-            </w:r>
-            <w:r>
-              <w:rPr>
-                <w:sz w:val="21"/>
-                <w:szCs w:val="21"/>
-              </w:rPr>
-              <w:t xml:space="preserve">. Al mirar la distribución del índice, encontramos que </w:t>
-            </w:r>
-            <w:r>
-              <w:rPr>
-                <w:b/>
-                <w:bCs/>
-                <w:sz w:val="21"/>
-                <w:szCs w:val="21"/>
-              </w:rPr>
-              <w:t>[DATO]%</w:t>
-            </w:r>
-            <w:r>
-              <w:rPr>
-                <w:sz w:val="21"/>
-                <w:szCs w:val="21"/>
-              </w:rPr>
-              <w:t xml:space="preserve"> de los restaurantes tiene un IRS bajo, </w:t>
-            </w:r>
-            <w:r>
-              <w:rPr>
-                <w:b/>
-                <w:bCs/>
-                <w:sz w:val="21"/>
-                <w:szCs w:val="21"/>
-              </w:rPr>
-              <w:t>[DATO]%</w:t>
+              <w:t>80</w:t>
+            </w:r>
+            <w:r>
+              <w:rPr>
+                <w:b/>
+                <w:bCs/>
+                <w:sz w:val="21"/>
+                <w:szCs w:val="21"/>
+              </w:rPr>
+              <w:t>%</w:t>
+            </w:r>
+            <w:r>
+              <w:rPr>
+                <w:sz w:val="21"/>
+                <w:szCs w:val="21"/>
+              </w:rPr>
+              <w:t xml:space="preserve"> de los restaurantes declara invertir activamente en marketing digital. Las plataformas más usadas son</w:t>
+            </w:r>
+            <w:r>
+              <w:rPr>
+                <w:b/>
+                <w:bCs/>
+                <w:sz w:val="21"/>
+                <w:szCs w:val="21"/>
+              </w:rPr>
+              <w:t xml:space="preserve"> Facebook y Instagram.</w:t>
+            </w:r>
+            <w:r>
+              <w:rPr>
+                <w:sz w:val="21"/>
+                <w:szCs w:val="21"/>
+              </w:rPr>
+              <w:t xml:space="preserve"> Al mirar la distribución del índice, encontramos que </w:t>
+            </w:r>
+            <w:r>
+              <w:rPr>
+                <w:b/>
+                <w:bCs/>
+                <w:sz w:val="21"/>
+                <w:szCs w:val="21"/>
+              </w:rPr>
+              <w:t>25.7%</w:t>
+            </w:r>
+            <w:r>
+              <w:rPr>
+                <w:b/>
+                <w:bCs/>
+                <w:sz w:val="21"/>
+                <w:szCs w:val="21"/>
+              </w:rPr>
+              <w:t xml:space="preserve"> </w:t>
+            </w:r>
+            <w:r>
+              <w:rPr>
+                <w:sz w:val="21"/>
+                <w:szCs w:val="21"/>
+              </w:rPr>
+              <w:t xml:space="preserve">de los restaurantes tiene un IRS bajo, </w:t>
+            </w:r>
+            <w:r>
+              <w:rPr>
+                <w:b/>
+                <w:bCs/>
+                <w:sz w:val="21"/>
+                <w:szCs w:val="21"/>
+              </w:rPr>
+              <w:t>48.6%</w:t>
             </w:r>
             <w:r>
               <w:rPr>
@@ -3774,14 +3358,23 @@
                 <w:sz w:val="21"/>
                 <w:szCs w:val="21"/>
               </w:rPr>
-              <w:t>[DATO]%</w:t>
-            </w:r>
-            <w:r>
-              <w:rPr>
-                <w:sz w:val="21"/>
-                <w:szCs w:val="21"/>
-              </w:rPr>
-              <w:t xml:space="preserve"> un IRS alto.</w:t>
+              <w:t>25.7%</w:t>
+            </w:r>
+            <w:r>
+              <w:rPr>
+                <w:b/>
+                <w:bCs/>
+                <w:sz w:val="21"/>
+                <w:szCs w:val="21"/>
+              </w:rPr>
+              <w:t xml:space="preserve"> </w:t>
+            </w:r>
+            <w:r>
+              <w:rPr>
+                <w:sz w:val="21"/>
+                <w:szCs w:val="21"/>
+              </w:rPr>
+              <w:t>un IRS alto.</w:t>
             </w:r>
           </w:p>
           <w:p>
@@ -3978,60 +3571,19 @@
               <w:spacing w:line="320" w:lineRule="auto"/>
               <w:jc w:val="both"/>
             </w:pPr>
-            <w:proofErr w:type="spellStart"/>
-            <w:r>
-              <w:rPr>
-                <w:sz w:val="21"/>
-                <w:szCs w:val="21"/>
-              </w:rPr>
-              <w:t>Dashboard</w:t>
-            </w:r>
-            <w:proofErr w:type="spellEnd"/>
-            <w:r>
-              <w:rPr>
-                <w:sz w:val="21"/>
-                <w:szCs w:val="21"/>
-              </w:rPr>
-              <w:t xml:space="preserve"> visual con tres métricas principales: % con inversión activa, plataformas más usadas (barras horizontales), distribución IRS bajo/medio/alto</w:t>
-            </w:r>
-            <w:r>
-              <w:rPr>
-                <w:sz w:val="21"/>
-                <w:szCs w:val="21"/>
-              </w:rPr>
-              <w:t xml:space="preserve"> general (usar dona) y por </w:t>
-            </w:r>
-            <w:proofErr w:type="spellStart"/>
-            <w:r>
-              <w:rPr>
-                <w:sz w:val="21"/>
-                <w:szCs w:val="21"/>
-              </w:rPr>
-              <w:t>hot_zone</w:t>
-            </w:r>
-            <w:proofErr w:type="spellEnd"/>
-            <w:r>
-              <w:rPr>
-                <w:sz w:val="21"/>
-                <w:szCs w:val="21"/>
-              </w:rPr>
-              <w:t xml:space="preserve"> (mostrar gráfico de barras apiladas diferenciando entre </w:t>
-            </w:r>
-            <w:proofErr w:type="spellStart"/>
-            <w:r>
-              <w:rPr>
-                <w:sz w:val="21"/>
-                <w:szCs w:val="21"/>
-              </w:rPr>
-              <w:t>hot_zone</w:t>
-            </w:r>
-            <w:proofErr w:type="spellEnd"/>
-            <w:r>
-              <w:rPr>
-                <w:sz w:val="21"/>
-                <w:szCs w:val="21"/>
-              </w:rPr>
-              <w:t xml:space="preserve"> y no). </w:t>
+            <w:r>
+              <w:rPr>
+                <w:sz w:val="21"/>
+                <w:szCs w:val="21"/>
+              </w:rPr>
+              <w:t>Dashboard visual con tres métricas principales: % con inversión activa, plataformas más usadas (barras horizontales), distribución IRS bajo/medio/alto</w:t>
+            </w:r>
+            <w:r>
+              <w:rPr>
+                <w:sz w:val="21"/>
+                <w:szCs w:val="21"/>
+              </w:rPr>
+              <w:t xml:space="preserve"> general (usar dona) y por hot_zone (mostrar gráfico de barras apiladas diferenciando entre hot_zone y no). </w:t>
             </w:r>
             <w:r>
               <w:rPr>
@@ -4098,21 +3650,12 @@
               <w:spacing w:line="320" w:lineRule="auto"/>
               <w:jc w:val="both"/>
             </w:pPr>
-            <w:proofErr w:type="spellStart"/>
-            <w:r>
-              <w:rPr>
-                <w:sz w:val="21"/>
-                <w:szCs w:val="21"/>
-              </w:rPr>
-              <w:t>Dashboard</w:t>
-            </w:r>
-            <w:proofErr w:type="spellEnd"/>
-            <w:r>
-              <w:rPr>
-                <w:sz w:val="21"/>
-                <w:szCs w:val="21"/>
-              </w:rPr>
-              <w:t xml:space="preserve"> de resultados + desglose animado de componentes del IRS </w:t>
+            <w:r>
+              <w:rPr>
+                <w:sz w:val="21"/>
+                <w:szCs w:val="21"/>
+              </w:rPr>
+              <w:t xml:space="preserve">Dashboard de resultados + desglose animado de componentes del IRS </w:t>
             </w:r>
           </w:p>
         </w:tc>
@@ -4254,29 +3797,7 @@
                 <w:sz w:val="24"/>
                 <w:szCs w:val="24"/>
               </w:rPr>
-              <w:t xml:space="preserve">Índice de </w:t>
-            </w:r>
-            <w:proofErr w:type="spellStart"/>
-            <w:r>
-              <w:rPr>
-                <w:b/>
-                <w:bCs/>
-                <w:color w:val="FFFFFF"/>
-                <w:sz w:val="24"/>
-                <w:szCs w:val="24"/>
-              </w:rPr>
-              <w:t>Delivery</w:t>
-            </w:r>
-            <w:proofErr w:type="spellEnd"/>
-            <w:r>
-              <w:rPr>
-                <w:b/>
-                <w:bCs/>
-                <w:color w:val="FFFFFF"/>
-                <w:sz w:val="24"/>
-                <w:szCs w:val="24"/>
-              </w:rPr>
-              <w:t xml:space="preserve"> (IDL)</w:t>
+              <w:t>Índice de Delivery (IDL)</w:t>
             </w:r>
           </w:p>
         </w:tc>
@@ -4345,327 +3866,230 @@
                 <w:sz w:val="21"/>
                 <w:szCs w:val="21"/>
               </w:rPr>
-              <w:t>Esa dependencia del tráfico de barrio lleva a la segunda pregunta: ¿qué pasa cuando el cliente no pasa por la puerta? El segundo eje mide exactamente eso</w:t>
-            </w:r>
-            <w:r>
-              <w:rPr>
-                <w:sz w:val="21"/>
-                <w:szCs w:val="21"/>
-              </w:rPr>
-              <w:t xml:space="preserve"> </w:t>
-            </w:r>
-            <w:r>
-              <w:rPr>
-                <w:sz w:val="21"/>
-                <w:szCs w:val="21"/>
-              </w:rPr>
-              <w:t xml:space="preserve">el Índice de </w:t>
-            </w:r>
-            <w:proofErr w:type="spellStart"/>
-            <w:r>
-              <w:rPr>
-                <w:sz w:val="21"/>
-                <w:szCs w:val="21"/>
-              </w:rPr>
-              <w:t>Delivery</w:t>
-            </w:r>
-            <w:proofErr w:type="spellEnd"/>
-            <w:r>
-              <w:rPr>
-                <w:sz w:val="21"/>
-                <w:szCs w:val="21"/>
-              </w:rPr>
-              <w:t>, o IDL, captura qué tanto los restaurantes están usando las plataformas de reparto no solo como canal de venta, sino como parte de su estrategia de posicionamiento</w:t>
-            </w:r>
-            <w:r>
-              <w:rPr>
-                <w:sz w:val="21"/>
-                <w:szCs w:val="21"/>
-              </w:rPr>
-              <w:t>.</w:t>
-            </w:r>
-          </w:p>
-          <w:p>
-            <w:pPr>
-              <w:spacing w:line="320" w:lineRule="auto"/>
-              <w:jc w:val="both"/>
-            </w:pPr>
-            <w:r>
-              <w:rPr>
-                <w:sz w:val="21"/>
-                <w:szCs w:val="21"/>
-              </w:rPr>
-              <w:t xml:space="preserve">El IDL captura cinco componentes: si el restaurante usa datos de </w:t>
-            </w:r>
-            <w:proofErr w:type="spellStart"/>
-            <w:r>
-              <w:rPr>
-                <w:sz w:val="21"/>
-                <w:szCs w:val="21"/>
-              </w:rPr>
-              <w:t>delivery</w:t>
-            </w:r>
-            <w:proofErr w:type="spellEnd"/>
-            <w:r>
-              <w:rPr>
-                <w:sz w:val="21"/>
-                <w:szCs w:val="21"/>
-              </w:rPr>
-              <w:t xml:space="preserve"> para tomar decisiones, si el </w:t>
-            </w:r>
-            <w:proofErr w:type="spellStart"/>
-            <w:r>
-              <w:rPr>
-                <w:sz w:val="21"/>
-                <w:szCs w:val="21"/>
-              </w:rPr>
-              <w:t>delivery</w:t>
-            </w:r>
-            <w:proofErr w:type="spellEnd"/>
-            <w:r>
-              <w:rPr>
-                <w:sz w:val="21"/>
-                <w:szCs w:val="21"/>
-              </w:rPr>
-              <w:t xml:space="preserve"> es su canal principal de descubrimiento, qué proporción de sus ventas vienen por plataformas, si percibe el </w:t>
-            </w:r>
-            <w:proofErr w:type="spellStart"/>
-            <w:r>
-              <w:rPr>
-                <w:sz w:val="21"/>
-                <w:szCs w:val="21"/>
-              </w:rPr>
-              <w:t>delivery</w:t>
-            </w:r>
-            <w:proofErr w:type="spellEnd"/>
-            <w:r>
-              <w:rPr>
-                <w:sz w:val="21"/>
-                <w:szCs w:val="21"/>
-              </w:rPr>
-              <w:t xml:space="preserve"> como su canal más rentable, y con qué frecuencia consulta los datos que esas plataformas le ofrecen. El puntaje máximo es 10. Un restaurante con IDL alto no solo está en </w:t>
-            </w:r>
-            <w:proofErr w:type="spellStart"/>
-            <w:r>
-              <w:rPr>
-                <w:sz w:val="21"/>
-                <w:szCs w:val="21"/>
-              </w:rPr>
-              <w:t>Rappi</w:t>
-            </w:r>
-            <w:proofErr w:type="spellEnd"/>
-            <w:r>
-              <w:rPr>
-                <w:sz w:val="21"/>
-                <w:szCs w:val="21"/>
-              </w:rPr>
-              <w:t xml:space="preserve"> — </w:t>
-            </w:r>
-            <w:r>
-              <w:rPr>
-                <w:b/>
-                <w:bCs/>
-                <w:sz w:val="21"/>
-                <w:szCs w:val="21"/>
-              </w:rPr>
-              <w:t>toma decisiones de menú, precio y promociones con base en los datos que la plataforma le genera</w:t>
-            </w:r>
-            <w:r>
-              <w:rPr>
-                <w:sz w:val="21"/>
-                <w:szCs w:val="21"/>
-              </w:rPr>
-              <w:t xml:space="preserve">. </w:t>
-            </w:r>
-            <w:r>
-              <w:rPr>
-                <w:sz w:val="21"/>
-                <w:szCs w:val="21"/>
-              </w:rPr>
-              <w:t>En promedio,</w:t>
-            </w:r>
-            <w:r>
-              <w:rPr>
-                <w:sz w:val="21"/>
-                <w:szCs w:val="21"/>
-              </w:rPr>
-              <w:t xml:space="preserve"> los re</w:t>
-            </w:r>
-            <w:r>
-              <w:rPr>
-                <w:sz w:val="21"/>
-                <w:szCs w:val="21"/>
-              </w:rPr>
-              <w:t>s</w:t>
-            </w:r>
-            <w:r>
-              <w:rPr>
-                <w:sz w:val="21"/>
-                <w:szCs w:val="21"/>
-              </w:rPr>
-              <w:t>t</w:t>
-            </w:r>
-            <w:r>
-              <w:rPr>
-                <w:sz w:val="21"/>
-                <w:szCs w:val="21"/>
-              </w:rPr>
-              <w:t>a</w:t>
-            </w:r>
-            <w:r>
-              <w:rPr>
-                <w:sz w:val="21"/>
-                <w:szCs w:val="21"/>
-              </w:rPr>
-              <w:t>urantes reportaron que,</w:t>
-            </w:r>
-            <w:r>
-              <w:rPr>
-                <w:sz w:val="21"/>
-                <w:szCs w:val="21"/>
-              </w:rPr>
-              <w:t xml:space="preserve"> </w:t>
-            </w:r>
-            <w:r>
-              <w:rPr>
-                <w:b/>
-                <w:bCs/>
-                <w:color w:val="C00000"/>
-                <w:sz w:val="21"/>
-                <w:szCs w:val="21"/>
-              </w:rPr>
-              <w:t>[DATO]</w:t>
-            </w:r>
-            <w:r>
-              <w:rPr>
-                <w:sz w:val="21"/>
-                <w:szCs w:val="21"/>
-              </w:rPr>
-              <w:t xml:space="preserve"> de cada 10 clientes llega a través de plataformas de </w:t>
-            </w:r>
-            <w:proofErr w:type="spellStart"/>
-            <w:r>
-              <w:rPr>
-                <w:sz w:val="21"/>
-                <w:szCs w:val="21"/>
-              </w:rPr>
-              <w:t>delivery</w:t>
-            </w:r>
-            <w:proofErr w:type="spellEnd"/>
-            <w:r>
-              <w:rPr>
-                <w:sz w:val="21"/>
-                <w:szCs w:val="21"/>
-              </w:rPr>
-              <w:t xml:space="preserve">, y la mayoría afirmo </w:t>
-            </w:r>
-            <w:proofErr w:type="spellStart"/>
-            <w:r>
-              <w:rPr>
-                <w:sz w:val="21"/>
-                <w:szCs w:val="21"/>
-              </w:rPr>
-              <w:t>antender</w:t>
-            </w:r>
-            <w:proofErr w:type="spellEnd"/>
-            <w:r>
-              <w:rPr>
-                <w:sz w:val="21"/>
-                <w:szCs w:val="21"/>
-              </w:rPr>
-              <w:t xml:space="preserve"> a más de la mitad de sus clientes de manera presencial</w:t>
-            </w:r>
-            <w:r>
-              <w:rPr>
-                <w:sz w:val="21"/>
-                <w:szCs w:val="21"/>
-              </w:rPr>
-              <w:t xml:space="preserve">. </w:t>
-            </w:r>
-            <w:r>
-              <w:rPr>
-                <w:b/>
-                <w:bCs/>
-                <w:color w:val="C00000"/>
-                <w:sz w:val="21"/>
-                <w:szCs w:val="21"/>
-              </w:rPr>
-              <w:t>[DATO]%</w:t>
-            </w:r>
-            <w:r>
-              <w:rPr>
-                <w:sz w:val="21"/>
-                <w:szCs w:val="21"/>
-              </w:rPr>
-              <w:t xml:space="preserve"> accede a los datos de comportamiento de plataformas, </w:t>
-            </w:r>
-            <w:r>
-              <w:rPr>
-                <w:sz w:val="21"/>
-                <w:szCs w:val="21"/>
-              </w:rPr>
-              <w:t>y</w:t>
-            </w:r>
-            <w:r>
-              <w:rPr>
-                <w:sz w:val="21"/>
-                <w:szCs w:val="21"/>
-              </w:rPr>
-              <w:t xml:space="preserve"> solo </w:t>
-            </w:r>
-            <w:r>
-              <w:rPr>
-                <w:b/>
-                <w:bCs/>
-                <w:color w:val="C00000"/>
-                <w:sz w:val="21"/>
-                <w:szCs w:val="21"/>
-              </w:rPr>
-              <w:t>[DATO]%</w:t>
-            </w:r>
-            <w:r>
-              <w:rPr>
-                <w:sz w:val="21"/>
-                <w:szCs w:val="21"/>
-              </w:rPr>
-              <w:t xml:space="preserve"> los usa activamente. </w:t>
-            </w:r>
-            <w:r>
-              <w:rPr>
-                <w:sz w:val="21"/>
-                <w:szCs w:val="21"/>
-              </w:rPr>
-              <w:t xml:space="preserve">A partir de esto se puede intuir que hay una barrera de entrada importante frente a las plataformas de </w:t>
-            </w:r>
-            <w:proofErr w:type="spellStart"/>
-            <w:r>
-              <w:rPr>
-                <w:sz w:val="21"/>
-                <w:szCs w:val="21"/>
-              </w:rPr>
-              <w:t>delivery</w:t>
-            </w:r>
-            <w:proofErr w:type="spellEnd"/>
-            <w:r>
-              <w:rPr>
-                <w:sz w:val="21"/>
-                <w:szCs w:val="21"/>
-              </w:rPr>
-              <w:t xml:space="preserve"> dado la baja </w:t>
-            </w:r>
-            <w:r>
-              <w:rPr>
-                <w:sz w:val="21"/>
-                <w:szCs w:val="21"/>
-              </w:rPr>
-              <w:t>participación en estos espacios, independientemente del tipo de cocina y la ubicación del restaurante</w:t>
-            </w:r>
-            <w:r>
-              <w:rPr>
-                <w:sz w:val="21"/>
-                <w:szCs w:val="21"/>
-              </w:rPr>
-              <w:t>.</w:t>
+              <w:t xml:space="preserve">Esa dependencia del tráfico de barrio abre una segunda pregunta clave: </w:t>
+            </w:r>
+            <w:r>
+              <w:rPr>
+                <w:b/>
+                <w:bCs/>
+                <w:sz w:val="21"/>
+                <w:szCs w:val="21"/>
+              </w:rPr>
+              <w:t>¿qué pasa cuando el cliente ya no pasa por la puerta, sino que decide desde una aplicación?</w:t>
+            </w:r>
+          </w:p>
+          <w:p>
+            <w:pPr>
+              <w:spacing w:line="320" w:lineRule="auto"/>
+              <w:jc w:val="both"/>
+              <w:rPr>
+                <w:sz w:val="21"/>
+                <w:szCs w:val="21"/>
+              </w:rPr>
+            </w:pPr>
+            <w:r>
+              <w:rPr>
+                <w:sz w:val="21"/>
+                <w:szCs w:val="21"/>
+              </w:rPr>
+              <w:t xml:space="preserve">Para responderla, construimos el </w:t>
+            </w:r>
+            <w:r>
+              <w:rPr>
+                <w:b/>
+                <w:bCs/>
+                <w:sz w:val="21"/>
+                <w:szCs w:val="21"/>
+              </w:rPr>
+              <w:t>Índice de Delivery</w:t>
+            </w:r>
+            <w:r>
+              <w:rPr>
+                <w:sz w:val="21"/>
+                <w:szCs w:val="21"/>
+              </w:rPr>
+              <w:t xml:space="preserve">, o </w:t>
+            </w:r>
+            <w:r>
+              <w:rPr>
+                <w:b/>
+                <w:bCs/>
+                <w:sz w:val="21"/>
+                <w:szCs w:val="21"/>
+              </w:rPr>
+              <w:t>IDL</w:t>
+            </w:r>
+            <w:r>
+              <w:rPr>
+                <w:sz w:val="21"/>
+                <w:szCs w:val="21"/>
+              </w:rPr>
+              <w:t>, que mide qué tanto los restaurantes usan las plataformas de reparto no solo como un canal de venta, sino como parte de su estrategia de posicionamiento.</w:t>
+            </w:r>
+          </w:p>
+          <w:p>
+            <w:pPr>
+              <w:spacing w:line="320" w:lineRule="auto"/>
+              <w:jc w:val="both"/>
+              <w:rPr>
+                <w:sz w:val="21"/>
+                <w:szCs w:val="21"/>
+              </w:rPr>
+            </w:pPr>
+            <w:r>
+              <w:rPr>
+                <w:sz w:val="21"/>
+                <w:szCs w:val="21"/>
+              </w:rPr>
+              <w:t>Este índice evalúa cinco aspectos: si el restaurante usa datos de delivery para tomar decisiones, si estas plataformas ayudan a atraer nuevos clientes, qué proporción de sus ventas viene por aplicaciones, si perciben el delivery como un canal rentable y con qué frecuencia revisan la información que estas plataformas les ofrecen.</w:t>
+            </w:r>
+          </w:p>
+          <w:p>
+            <w:pPr>
+              <w:spacing w:line="320" w:lineRule="auto"/>
+              <w:jc w:val="both"/>
+              <w:rPr>
+                <w:sz w:val="21"/>
+                <w:szCs w:val="21"/>
+              </w:rPr>
+            </w:pPr>
+            <w:r>
+              <w:rPr>
+                <w:sz w:val="21"/>
+                <w:szCs w:val="21"/>
+              </w:rPr>
+              <w:t>Un restaurante con IDL alto no es simplemente el que está en Rappi o DiDi. Es el que usa esos datos para ajustar su menú, definir precios, diseñar promociones y entender mejor el comportamiento de sus clientes.</w:t>
+            </w:r>
+          </w:p>
+          <w:p>
+            <w:pPr>
+              <w:spacing w:line="320" w:lineRule="auto"/>
+              <w:jc w:val="both"/>
+              <w:rPr>
+                <w:sz w:val="21"/>
+                <w:szCs w:val="21"/>
+              </w:rPr>
+            </w:pPr>
+            <w:r>
+              <w:rPr>
+                <w:sz w:val="21"/>
+                <w:szCs w:val="21"/>
+              </w:rPr>
+              <w:t xml:space="preserve">Los resultados muestran una adopción todavía limitada. En promedio, los restaurantes reportan que apenas </w:t>
+            </w:r>
+            <w:r>
+              <w:rPr>
+                <w:b/>
+                <w:bCs/>
+                <w:sz w:val="21"/>
+                <w:szCs w:val="21"/>
+              </w:rPr>
+              <w:t>1,4 de cada 10 clientes</w:t>
+            </w:r>
+            <w:r>
+              <w:rPr>
+                <w:sz w:val="21"/>
+                <w:szCs w:val="21"/>
+              </w:rPr>
+              <w:t xml:space="preserve"> llega a través de plataformas de delivery, mientras que la mayoría afirma atender a más de la mitad de sus clientes de forma presencial. Además, aunque </w:t>
+            </w:r>
+            <w:r>
+              <w:rPr>
+                <w:b/>
+                <w:bCs/>
+                <w:sz w:val="21"/>
+                <w:szCs w:val="21"/>
+              </w:rPr>
+              <w:t>34,3%</w:t>
+            </w:r>
+            <w:r>
+              <w:rPr>
+                <w:sz w:val="21"/>
+                <w:szCs w:val="21"/>
+              </w:rPr>
+              <w:t xml:space="preserve"> accede a datos de comportamiento en plataformas, solo </w:t>
+            </w:r>
+            <w:r>
+              <w:rPr>
+                <w:b/>
+                <w:bCs/>
+                <w:sz w:val="21"/>
+                <w:szCs w:val="21"/>
+              </w:rPr>
+              <w:t>14,3%</w:t>
+            </w:r>
+            <w:r>
+              <w:rPr>
+                <w:sz w:val="21"/>
+                <w:szCs w:val="21"/>
+              </w:rPr>
+              <w:t xml:space="preserve"> los usa activamente para tomar decisiones.</w:t>
+            </w:r>
+          </w:p>
+          <w:p>
+            <w:pPr>
+              <w:spacing w:line="320" w:lineRule="auto"/>
+              <w:jc w:val="both"/>
+              <w:rPr>
+                <w:sz w:val="21"/>
+                <w:szCs w:val="21"/>
+              </w:rPr>
+            </w:pPr>
+            <w:r>
+              <w:rPr>
+                <w:sz w:val="21"/>
+                <w:szCs w:val="21"/>
+              </w:rPr>
+              <w:t xml:space="preserve">El promedio del IDL es de </w:t>
+            </w:r>
+            <w:r>
+              <w:rPr>
+                <w:b/>
+                <w:bCs/>
+                <w:sz w:val="21"/>
+                <w:szCs w:val="21"/>
+              </w:rPr>
+              <w:t>2,17 sobre 10</w:t>
+            </w:r>
+            <w:r>
+              <w:rPr>
+                <w:sz w:val="21"/>
+                <w:szCs w:val="21"/>
+              </w:rPr>
+              <w:t xml:space="preserve">, lo que evidencia una baja integración del delivery dentro de la estrategia digital del nicho. Sin embargo, aparece una diferencia importante por ubicación: los restaurantes en zonas de alta concentración gastronómica presentan un IDL </w:t>
+            </w:r>
+            <w:r>
+              <w:rPr>
+                <w:b/>
+                <w:bCs/>
+                <w:sz w:val="21"/>
+                <w:szCs w:val="21"/>
+              </w:rPr>
+              <w:t>2,8 puntos mayor</w:t>
+            </w:r>
+            <w:r>
+              <w:rPr>
+                <w:sz w:val="21"/>
+                <w:szCs w:val="21"/>
+              </w:rPr>
+              <w:t xml:space="preserve"> que aquellos ubicados de forma más dispersa. Esto sugiere que, donde la competencia es más intensa, el delivery empieza a jugar un papel más relevante.</w:t>
+            </w:r>
+          </w:p>
+          <w:p>
+            <w:pPr>
+              <w:spacing w:line="320" w:lineRule="auto"/>
+              <w:jc w:val="both"/>
+              <w:rPr>
+                <w:sz w:val="21"/>
+                <w:szCs w:val="21"/>
+              </w:rPr>
+            </w:pPr>
+            <w:r>
+              <w:rPr>
+                <w:sz w:val="21"/>
+                <w:szCs w:val="21"/>
+              </w:rPr>
+              <w:t>Aun así, el panorama general muestra una barrera clara: para muchos restaurantes mediterráneos en Bogotá, las plataformas de delivery todavía no son una herramienta estratégica de posicionamiento, sino un canal complementario con baja participación, independientemente del tipo de cocina o de la ubicación.</w:t>
             </w:r>
           </w:p>
         </w:tc>
@@ -4730,39 +4154,7 @@
                 <w:sz w:val="21"/>
                 <w:szCs w:val="21"/>
               </w:rPr>
-              <w:t xml:space="preserve">Barras apiladas: </w:t>
-            </w:r>
-            <w:proofErr w:type="spellStart"/>
-            <w:r>
-              <w:rPr>
-                <w:sz w:val="21"/>
-                <w:szCs w:val="21"/>
-              </w:rPr>
-              <w:t>mix</w:t>
-            </w:r>
-            <w:proofErr w:type="spellEnd"/>
-            <w:r>
-              <w:rPr>
-                <w:sz w:val="21"/>
-                <w:szCs w:val="21"/>
-              </w:rPr>
-              <w:t xml:space="preserve"> de ventas promedio (presencial / </w:t>
-            </w:r>
-            <w:proofErr w:type="spellStart"/>
-            <w:r>
-              <w:rPr>
-                <w:sz w:val="21"/>
-                <w:szCs w:val="21"/>
-              </w:rPr>
-              <w:t>delivery</w:t>
-            </w:r>
-            <w:proofErr w:type="spellEnd"/>
-            <w:r>
-              <w:rPr>
-                <w:sz w:val="21"/>
-                <w:szCs w:val="21"/>
-              </w:rPr>
-              <w:t xml:space="preserve"> / domicilio propio). Dato destacado en grande: brecha acceso vs. uso de datos de plataformas (</w:t>
+              <w:t>Barras apiladas: mix de ventas promedio (presencial / delivery / domicilio propio). Dato destacado en grande: brecha acceso vs. uso de datos de plataformas (</w:t>
             </w:r>
             <w:r>
               <w:rPr>
@@ -4772,14 +4164,7 @@
                 <w:sz w:val="21"/>
                 <w:szCs w:val="21"/>
               </w:rPr>
-              <w:t>[DATO]%</w:t>
-            </w:r>
-            <w:r>
-              <w:rPr>
-                <w:sz w:val="21"/>
-                <w:szCs w:val="21"/>
-              </w:rPr>
-              <w:t xml:space="preserve"> vs. </w:t>
+              <w:t>34.3%</w:t>
             </w:r>
             <w:r>
               <w:rPr>
@@ -4789,7 +4174,24 @@
                 <w:sz w:val="21"/>
                 <w:szCs w:val="21"/>
               </w:rPr>
-              <w:t>[DATO]%</w:t>
+              <w:t xml:space="preserve"> </w:t>
+            </w:r>
+            <w:r>
+              <w:rPr>
+                <w:sz w:val="21"/>
+                <w:szCs w:val="21"/>
+              </w:rPr>
+              <w:t xml:space="preserve">vs. </w:t>
+            </w:r>
+            <w:r>
+              <w:rPr>
+                <w:b/>
+                <w:bCs/>
+                <w:color w:val="C00000"/>
+                <w:sz w:val="21"/>
+                <w:szCs w:val="21"/>
+              </w:rPr>
+              <w:t>14.3%</w:t>
             </w:r>
             <w:r>
               <w:rPr>
@@ -4831,6 +4233,7 @@
                 <w:sz w:val="20"/>
                 <w:szCs w:val="20"/>
               </w:rPr>
+              <w:lastRenderedPageBreak/>
               <w:t>RECURSO</w:t>
             </w:r>
           </w:p>
@@ -4861,23 +4264,7 @@
                 <w:sz w:val="21"/>
                 <w:szCs w:val="21"/>
               </w:rPr>
-              <w:t xml:space="preserve">Desglose animado de componentes IDL + barras apiladas de </w:t>
-            </w:r>
-            <w:proofErr w:type="spellStart"/>
-            <w:r>
-              <w:rPr>
-                <w:sz w:val="21"/>
-                <w:szCs w:val="21"/>
-              </w:rPr>
-              <w:t>mix</w:t>
-            </w:r>
-            <w:proofErr w:type="spellEnd"/>
-            <w:r>
-              <w:rPr>
-                <w:sz w:val="21"/>
-                <w:szCs w:val="21"/>
-              </w:rPr>
-              <w:t xml:space="preserve"> de ventas + mapa de Bogotá coloreado por IDL (misma base que E5, crea consistencia visual).</w:t>
+              <w:t>Desglose animado de componentes IDL + barras apiladas de mix de ventas + mapa de Bogotá coloreado por IDL (misma base que E5, crea consistencia visual).</w:t>
             </w:r>
           </w:p>
         </w:tc>
@@ -4942,23 +4329,7 @@
                 <w:sz w:val="21"/>
                 <w:szCs w:val="21"/>
               </w:rPr>
-              <w:t xml:space="preserve">La brecha 'acceso vs. uso de datos' es el </w:t>
-            </w:r>
-            <w:proofErr w:type="spellStart"/>
-            <w:r>
-              <w:rPr>
-                <w:sz w:val="21"/>
-                <w:szCs w:val="21"/>
-              </w:rPr>
-              <w:t>insight</w:t>
-            </w:r>
-            <w:proofErr w:type="spellEnd"/>
-            <w:r>
-              <w:rPr>
-                <w:sz w:val="21"/>
-                <w:szCs w:val="21"/>
-              </w:rPr>
-              <w:t xml:space="preserve"> más poderoso de este eje — darle pausa y énfasis vocal. La frase flotante puede permanecer 2–3 segundos después del narrador. Si la diferencia geográfica en IDL es pequeña, el narrador puede decirlo explícitamente: ese también es un hallazgo.</w:t>
+              <w:t>La brecha 'acceso vs. uso de datos' es el insight más poderoso de este eje — darle pausa y énfasis vocal. La frase flotante puede permanecer 2–3 segundos después del narrador. Si la diferencia geográfica en IDL es pequeña, el narrador puede decirlo explícitamente: ese también es un hallazgo.</w:t>
             </w:r>
           </w:p>
         </w:tc>
@@ -5069,295 +4440,342 @@
                 <w:sz w:val="20"/>
                 <w:szCs w:val="20"/>
               </w:rPr>
+              <w:t>NARRACIÓN</w:t>
+            </w:r>
+          </w:p>
+        </w:tc>
+        <w:tc>
+          <w:tcPr>
+            <w:tcW w:w="7760" w:type="dxa"/>
+            <w:tcBorders>
+              <w:top w:val="single" w:sz="1" w:space="0" w:color="CCCCCC"/>
+              <w:left w:val="single" w:sz="1" w:space="0" w:color="CCCCCC"/>
+              <w:bottom w:val="single" w:sz="1" w:space="0" w:color="CCCCCC"/>
+              <w:right w:val="single" w:sz="1" w:space="0" w:color="CCCCCC"/>
+            </w:tcBorders>
+            <w:tcMar>
+              <w:top w:w="100" w:type="dxa"/>
+              <w:left w:w="160" w:type="dxa"/>
+              <w:bottom w:w="100" w:type="dxa"/>
+              <w:right w:w="160" w:type="dxa"/>
+            </w:tcMar>
+          </w:tcPr>
+          <w:p>
+            <w:pPr>
+              <w:spacing w:line="320" w:lineRule="auto"/>
+              <w:jc w:val="both"/>
+              <w:rPr>
+                <w:sz w:val="21"/>
+                <w:szCs w:val="21"/>
+              </w:rPr>
+            </w:pPr>
+            <w:r>
+              <w:rPr>
+                <w:sz w:val="21"/>
+                <w:szCs w:val="21"/>
+              </w:rPr>
+              <w:t xml:space="preserve">Y si la adopción del delivery todavía es limitada, hay algo que ningún restaurante puede evitar: </w:t>
+            </w:r>
+            <w:r>
+              <w:rPr>
+                <w:b/>
+                <w:bCs/>
+                <w:sz w:val="21"/>
+                <w:szCs w:val="21"/>
+              </w:rPr>
+              <w:t>que sus clientes opinen</w:t>
+            </w:r>
+            <w:r>
+              <w:rPr>
+                <w:sz w:val="21"/>
+                <w:szCs w:val="21"/>
+              </w:rPr>
+              <w:t>.</w:t>
+            </w:r>
+          </w:p>
+          <w:p>
+            <w:pPr>
+              <w:spacing w:line="320" w:lineRule="auto"/>
+              <w:jc w:val="both"/>
+              <w:rPr>
+                <w:sz w:val="21"/>
+                <w:szCs w:val="21"/>
+              </w:rPr>
+            </w:pPr>
+            <w:r>
+              <w:rPr>
+                <w:sz w:val="21"/>
+                <w:szCs w:val="21"/>
+              </w:rPr>
+              <w:t xml:space="preserve">Las reseñas en Google Maps y TripAdvisor están ahí aunque el restaurante no las gestione, aunque el dueño no las revise o aunque no respondan a tiempo. Y en un nicho como la cocina mediterránea, que para muchos consumidores en Bogotá todavía puede ser menos familiar, esa reputación acumulada cumple una función clave: </w:t>
+            </w:r>
+            <w:r>
+              <w:rPr>
+                <w:b/>
+                <w:bCs/>
+                <w:sz w:val="21"/>
+                <w:szCs w:val="21"/>
+              </w:rPr>
+              <w:t>informa, genera confianza y también puede convencer o disuadir</w:t>
+            </w:r>
+            <w:r>
+              <w:rPr>
+                <w:sz w:val="21"/>
+                <w:szCs w:val="21"/>
+              </w:rPr>
+              <w:t>.</w:t>
+            </w:r>
+          </w:p>
+          <w:p>
+            <w:pPr>
+              <w:spacing w:line="320" w:lineRule="auto"/>
+              <w:jc w:val="both"/>
+              <w:rPr>
+                <w:sz w:val="21"/>
+                <w:szCs w:val="21"/>
+              </w:rPr>
+            </w:pPr>
+            <w:r>
+              <w:rPr>
+                <w:sz w:val="21"/>
+                <w:szCs w:val="21"/>
+              </w:rPr>
+              <w:t xml:space="preserve">Por eso construimos el </w:t>
+            </w:r>
+            <w:r>
+              <w:rPr>
+                <w:b/>
+                <w:bCs/>
+                <w:sz w:val="21"/>
+                <w:szCs w:val="21"/>
+              </w:rPr>
+              <w:t>Índice de Plataformas de Opinión</w:t>
+            </w:r>
+            <w:r>
+              <w:rPr>
+                <w:sz w:val="21"/>
+                <w:szCs w:val="21"/>
+              </w:rPr>
+              <w:t xml:space="preserve">, o </w:t>
+            </w:r>
+            <w:r>
+              <w:rPr>
+                <w:b/>
+                <w:bCs/>
+                <w:sz w:val="21"/>
+                <w:szCs w:val="21"/>
+              </w:rPr>
+              <w:t>IPO</w:t>
+            </w:r>
+            <w:r>
+              <w:rPr>
+                <w:sz w:val="21"/>
+                <w:szCs w:val="21"/>
+              </w:rPr>
+              <w:t>, el índice más robusto del análisis. A diferencia de los otros, este combina lo que los restaurantes reportan en la encuesta con datos observados directamente en Google Maps y TripAdvisor.</w:t>
+            </w:r>
+          </w:p>
+          <w:p>
+            <w:pPr>
+              <w:spacing w:line="320" w:lineRule="auto"/>
+              <w:jc w:val="both"/>
+              <w:rPr>
+                <w:sz w:val="21"/>
+                <w:szCs w:val="21"/>
+              </w:rPr>
+            </w:pPr>
+            <w:r>
+              <w:rPr>
+                <w:sz w:val="21"/>
+                <w:szCs w:val="21"/>
+              </w:rPr>
+              <w:t>El IPO mide aspectos como la inversión en Google Ads, la importancia de estas plataformas como canal de descubrimiento, el número de reseñas, la calificación promedio, la presencia en TripAdvisor y el uso de inteligencia artificial para gestionar opiniones. En otras palabras, no mide solo cuántas estrellas tiene un restaurante, sino qué tan sólida es su reputación digital.</w:t>
+            </w:r>
+          </w:p>
+          <w:p>
+            <w:pPr>
+              <w:spacing w:line="320" w:lineRule="auto"/>
+              <w:jc w:val="both"/>
+              <w:rPr>
+                <w:sz w:val="21"/>
+                <w:szCs w:val="21"/>
+              </w:rPr>
+            </w:pPr>
+            <w:r>
+              <w:rPr>
+                <w:sz w:val="21"/>
+                <w:szCs w:val="21"/>
+              </w:rPr>
+              <w:t xml:space="preserve">Los datos muestran que este es el eje con mayor desarrollo dentro del nicho. En promedio, los restaurantes tienen </w:t>
+            </w:r>
+            <w:r>
+              <w:rPr>
+                <w:b/>
+                <w:bCs/>
+                <w:sz w:val="21"/>
+                <w:szCs w:val="21"/>
+              </w:rPr>
+              <w:t>1.316 reseñas en Google Maps</w:t>
+            </w:r>
+            <w:r>
+              <w:rPr>
+                <w:sz w:val="21"/>
+                <w:szCs w:val="21"/>
+              </w:rPr>
+              <w:t xml:space="preserve"> y una calificación promedio de </w:t>
+            </w:r>
+            <w:r>
+              <w:rPr>
+                <w:b/>
+                <w:bCs/>
+                <w:sz w:val="21"/>
+                <w:szCs w:val="21"/>
+              </w:rPr>
+              <w:t>4,52 estrellas</w:t>
+            </w:r>
+            <w:r>
+              <w:rPr>
+                <w:sz w:val="21"/>
+                <w:szCs w:val="21"/>
+              </w:rPr>
+              <w:t xml:space="preserve">. Además, </w:t>
+            </w:r>
+            <w:r>
+              <w:rPr>
+                <w:b/>
+                <w:bCs/>
+                <w:sz w:val="21"/>
+                <w:szCs w:val="21"/>
+              </w:rPr>
+              <w:t>82,9%</w:t>
+            </w:r>
+            <w:r>
+              <w:rPr>
+                <w:sz w:val="21"/>
+                <w:szCs w:val="21"/>
+              </w:rPr>
+              <w:t xml:space="preserve"> cuenta con perfil activo en TripAdvisor. En la distribución del índice, </w:t>
+            </w:r>
+            <w:r>
+              <w:rPr>
+                <w:b/>
+                <w:bCs/>
+                <w:sz w:val="21"/>
+                <w:szCs w:val="21"/>
+              </w:rPr>
+              <w:t>11,4%</w:t>
+            </w:r>
+            <w:r>
+              <w:rPr>
+                <w:sz w:val="21"/>
+                <w:szCs w:val="21"/>
+              </w:rPr>
+              <w:t xml:space="preserve"> de los restaurantes tiene un IPO bajo, </w:t>
+            </w:r>
+            <w:r>
+              <w:rPr>
+                <w:b/>
+                <w:bCs/>
+                <w:sz w:val="21"/>
+                <w:szCs w:val="21"/>
+              </w:rPr>
+              <w:t>48,6%</w:t>
+            </w:r>
+            <w:r>
+              <w:rPr>
+                <w:sz w:val="21"/>
+                <w:szCs w:val="21"/>
+              </w:rPr>
+              <w:t xml:space="preserve"> un IPO medio y </w:t>
+            </w:r>
+            <w:r>
+              <w:rPr>
+                <w:b/>
+                <w:bCs/>
+                <w:sz w:val="21"/>
+                <w:szCs w:val="21"/>
+              </w:rPr>
+              <w:t>40%</w:t>
+            </w:r>
+            <w:r>
+              <w:rPr>
+                <w:sz w:val="21"/>
+                <w:szCs w:val="21"/>
+              </w:rPr>
+              <w:t xml:space="preserve"> un IPO alto.</w:t>
+            </w:r>
+          </w:p>
+          <w:p>
+            <w:pPr>
+              <w:spacing w:line="320" w:lineRule="auto"/>
+              <w:jc w:val="both"/>
+              <w:rPr>
+                <w:sz w:val="21"/>
+                <w:szCs w:val="21"/>
+              </w:rPr>
+            </w:pPr>
+            <w:r>
+              <w:rPr>
+                <w:sz w:val="21"/>
+                <w:szCs w:val="21"/>
+              </w:rPr>
+              <w:t xml:space="preserve">La comparación por ubicación también muestra una diferencia importante. Entre los restaurantes con </w:t>
+            </w:r>
+            <w:r>
+              <w:rPr>
+                <w:b/>
+                <w:bCs/>
+                <w:sz w:val="21"/>
+                <w:szCs w:val="21"/>
+              </w:rPr>
+              <w:t>IPO alto</w:t>
+            </w:r>
+            <w:r>
+              <w:rPr>
+                <w:sz w:val="21"/>
+                <w:szCs w:val="21"/>
+              </w:rPr>
+              <w:t xml:space="preserve">, el </w:t>
+            </w:r>
+            <w:r>
+              <w:rPr>
+                <w:b/>
+                <w:bCs/>
+                <w:sz w:val="21"/>
+                <w:szCs w:val="21"/>
+              </w:rPr>
+              <w:t>78,57%</w:t>
+            </w:r>
+            <w:r>
+              <w:rPr>
+                <w:sz w:val="21"/>
+                <w:szCs w:val="21"/>
+              </w:rPr>
+              <w:t xml:space="preserve"> está ubicado en zonas de alta concentración gastronómica, mientras que solo el </w:t>
+            </w:r>
+            <w:r>
+              <w:rPr>
+                <w:b/>
+                <w:bCs/>
+                <w:sz w:val="21"/>
+                <w:szCs w:val="21"/>
+              </w:rPr>
+              <w:t>21,43%</w:t>
+            </w:r>
+            <w:r>
+              <w:rPr>
+                <w:sz w:val="21"/>
+                <w:szCs w:val="21"/>
+              </w:rPr>
+              <w:t xml:space="preserve"> se encuentra en zonas dispersas. Además, ningún restaurante de estas zonas concentradas aparece en el nivel bajo del índice. Esto sugiere que, donde hay más competencia, la reputación digital se vuelve todavía más importante: no basta con tener buenas </w:t>
+            </w:r>
+            <w:r>
+              <w:rPr>
+                <w:sz w:val="21"/>
+                <w:szCs w:val="21"/>
+              </w:rPr>
               <w:lastRenderedPageBreak/>
-              <w:t>NARRACIÓN</w:t>
-            </w:r>
-          </w:p>
-        </w:tc>
-        <w:tc>
-          <w:tcPr>
-            <w:tcW w:w="7760" w:type="dxa"/>
-            <w:tcBorders>
-              <w:top w:val="single" w:sz="1" w:space="0" w:color="CCCCCC"/>
-              <w:left w:val="single" w:sz="1" w:space="0" w:color="CCCCCC"/>
-              <w:bottom w:val="single" w:sz="1" w:space="0" w:color="CCCCCC"/>
-              <w:right w:val="single" w:sz="1" w:space="0" w:color="CCCCCC"/>
-            </w:tcBorders>
-            <w:tcMar>
-              <w:top w:w="100" w:type="dxa"/>
-              <w:left w:w="160" w:type="dxa"/>
-              <w:bottom w:w="100" w:type="dxa"/>
-              <w:right w:w="160" w:type="dxa"/>
-            </w:tcMar>
-          </w:tcPr>
-          <w:p>
-            <w:pPr>
-              <w:spacing w:line="320" w:lineRule="auto"/>
-              <w:jc w:val="both"/>
-              <w:rPr>
-                <w:sz w:val="21"/>
-                <w:szCs w:val="21"/>
-              </w:rPr>
-            </w:pPr>
-            <w:r>
-              <w:rPr>
-                <w:sz w:val="21"/>
-                <w:szCs w:val="21"/>
-              </w:rPr>
-              <w:t xml:space="preserve">Y si la barrera al </w:t>
-            </w:r>
-            <w:proofErr w:type="spellStart"/>
-            <w:r>
-              <w:rPr>
-                <w:sz w:val="21"/>
-                <w:szCs w:val="21"/>
-              </w:rPr>
-              <w:t>delivery</w:t>
-            </w:r>
-            <w:proofErr w:type="spellEnd"/>
-            <w:r>
-              <w:rPr>
-                <w:sz w:val="21"/>
-                <w:szCs w:val="21"/>
-              </w:rPr>
-              <w:t xml:space="preserve"> es generalizada, hay algo que ningún restaurante puede evitar</w:t>
-            </w:r>
-            <w:r>
-              <w:rPr>
-                <w:sz w:val="21"/>
-                <w:szCs w:val="21"/>
-              </w:rPr>
-              <w:t xml:space="preserve">, </w:t>
-            </w:r>
-            <w:r>
-              <w:rPr>
-                <w:sz w:val="21"/>
-                <w:szCs w:val="21"/>
-              </w:rPr>
-              <w:t xml:space="preserve">que sus clientes opinen. Las reseñas en Google </w:t>
-            </w:r>
-            <w:proofErr w:type="spellStart"/>
-            <w:r>
-              <w:rPr>
-                <w:sz w:val="21"/>
-                <w:szCs w:val="21"/>
-              </w:rPr>
-              <w:t>Maps</w:t>
-            </w:r>
-            <w:proofErr w:type="spellEnd"/>
-            <w:r>
-              <w:rPr>
-                <w:sz w:val="21"/>
-                <w:szCs w:val="21"/>
-              </w:rPr>
-              <w:t xml:space="preserve"> y TripAdvisor están ahí aunque nadie las gestione, aunque el dueño ni las lea. Y para la cocina mediterránea, un nicho que muchos bogotanos todavía no conocen bien, esa reputación acumulada no solo informa: convence. O disuade. </w:t>
-            </w:r>
-          </w:p>
-          <w:p>
-            <w:pPr>
-              <w:spacing w:line="320" w:lineRule="auto"/>
-              <w:jc w:val="both"/>
-            </w:pPr>
-            <w:r>
-              <w:rPr>
-                <w:sz w:val="21"/>
-                <w:szCs w:val="21"/>
-              </w:rPr>
-              <w:t>Eso es lo que mide el tercer eje, el Índice de Plataformas de Opinión, o IPO</w:t>
-            </w:r>
-            <w:r>
-              <w:rPr>
-                <w:sz w:val="21"/>
-                <w:szCs w:val="21"/>
-              </w:rPr>
-              <w:t>,</w:t>
-            </w:r>
-            <w:r>
-              <w:rPr>
-                <w:sz w:val="21"/>
-                <w:szCs w:val="21"/>
-              </w:rPr>
-              <w:t xml:space="preserve"> el índice más robusto del análisis</w:t>
-            </w:r>
-            <w:r>
-              <w:rPr>
-                <w:sz w:val="21"/>
-                <w:szCs w:val="21"/>
-              </w:rPr>
-              <w:t xml:space="preserve"> ya que, </w:t>
-            </w:r>
-            <w:r>
-              <w:rPr>
-                <w:sz w:val="21"/>
-                <w:szCs w:val="21"/>
-              </w:rPr>
-              <w:t xml:space="preserve">combina datos de la encuesta con datos observados directamente en Google </w:t>
-            </w:r>
-            <w:proofErr w:type="spellStart"/>
-            <w:r>
-              <w:rPr>
-                <w:sz w:val="21"/>
-                <w:szCs w:val="21"/>
-              </w:rPr>
-              <w:t>Maps</w:t>
-            </w:r>
-            <w:proofErr w:type="spellEnd"/>
-            <w:r>
-              <w:rPr>
-                <w:sz w:val="21"/>
-                <w:szCs w:val="21"/>
-              </w:rPr>
-              <w:t xml:space="preserve"> y TripAdvisor. Sus ocho componentes incluyen inversión en Google </w:t>
-            </w:r>
-            <w:proofErr w:type="spellStart"/>
-            <w:r>
-              <w:rPr>
-                <w:sz w:val="21"/>
-                <w:szCs w:val="21"/>
-              </w:rPr>
-              <w:t>Ads</w:t>
-            </w:r>
-            <w:proofErr w:type="spellEnd"/>
-            <w:r>
-              <w:rPr>
-                <w:sz w:val="21"/>
-                <w:szCs w:val="21"/>
-              </w:rPr>
-              <w:t xml:space="preserve">, canal de descubrimiento principal, número de reseñas, calificación promedio, presencia en TripAdvisor, reseñas y calificación en esa plataforma, y uso de IA para gestionar reseñas. El puntaje máximo es 18. Para la cocina mediterránea, cuya propuesta es culturalmente menos familiar en Bogotá que la italiana o la japonesa, las reseñas cumplen una función adicional: </w:t>
-            </w:r>
-            <w:r>
-              <w:rPr>
-                <w:b/>
-                <w:bCs/>
-                <w:sz w:val="21"/>
-                <w:szCs w:val="21"/>
-              </w:rPr>
-              <w:t>no solo informan — legitiman</w:t>
-            </w:r>
-            <w:r>
-              <w:rPr>
-                <w:sz w:val="21"/>
-                <w:szCs w:val="21"/>
-              </w:rPr>
-              <w:t xml:space="preserve">. El consumidor que no conoce la moussaka necesita más señales de confianza para decidir. El promedio de reseñas en Google </w:t>
-            </w:r>
-            <w:proofErr w:type="spellStart"/>
-            <w:r>
-              <w:rPr>
-                <w:sz w:val="21"/>
-                <w:szCs w:val="21"/>
-              </w:rPr>
-              <w:t>Maps</w:t>
-            </w:r>
-            <w:proofErr w:type="spellEnd"/>
-            <w:r>
-              <w:rPr>
-                <w:sz w:val="21"/>
-                <w:szCs w:val="21"/>
-              </w:rPr>
-              <w:t xml:space="preserve"> es </w:t>
-            </w:r>
-            <w:r>
-              <w:rPr>
-                <w:b/>
-                <w:bCs/>
-                <w:color w:val="C00000"/>
-                <w:sz w:val="21"/>
-                <w:szCs w:val="21"/>
-              </w:rPr>
-              <w:t>[DATO]</w:t>
-            </w:r>
-            <w:r>
-              <w:rPr>
-                <w:sz w:val="21"/>
-                <w:szCs w:val="21"/>
-              </w:rPr>
-              <w:t xml:space="preserve">, con calificación promedio de </w:t>
-            </w:r>
-            <w:r>
-              <w:rPr>
-                <w:b/>
-                <w:bCs/>
-                <w:color w:val="C00000"/>
-                <w:sz w:val="21"/>
-                <w:szCs w:val="21"/>
-              </w:rPr>
-              <w:t>[DATO]</w:t>
-            </w:r>
-            <w:r>
-              <w:rPr>
-                <w:sz w:val="21"/>
-                <w:szCs w:val="21"/>
-              </w:rPr>
-              <w:t xml:space="preserve"> estrellas. </w:t>
-            </w:r>
-            <w:r>
-              <w:rPr>
-                <w:b/>
-                <w:bCs/>
-                <w:color w:val="C00000"/>
-                <w:sz w:val="21"/>
-                <w:szCs w:val="21"/>
-              </w:rPr>
-              <w:t>[DATO]%</w:t>
-            </w:r>
-            <w:r>
-              <w:rPr>
-                <w:sz w:val="21"/>
-                <w:szCs w:val="21"/>
-              </w:rPr>
-              <w:t xml:space="preserve"> tiene perfil activo en TripAdvisor. Distribución del IPO: </w:t>
-            </w:r>
-            <w:r>
-              <w:rPr>
-                <w:b/>
-                <w:bCs/>
-                <w:color w:val="C00000"/>
-                <w:sz w:val="21"/>
-                <w:szCs w:val="21"/>
-              </w:rPr>
-              <w:t>[DATO]%</w:t>
-            </w:r>
-            <w:r>
-              <w:rPr>
-                <w:sz w:val="21"/>
-                <w:szCs w:val="21"/>
-              </w:rPr>
-              <w:t xml:space="preserve"> bajo, </w:t>
-            </w:r>
-            <w:r>
-              <w:rPr>
-                <w:b/>
-                <w:bCs/>
-                <w:color w:val="C00000"/>
-                <w:sz w:val="21"/>
-                <w:szCs w:val="21"/>
-              </w:rPr>
-              <w:t>[DATO]%</w:t>
-            </w:r>
-            <w:r>
-              <w:rPr>
-                <w:sz w:val="21"/>
-                <w:szCs w:val="21"/>
-              </w:rPr>
-              <w:t xml:space="preserve"> medio, </w:t>
-            </w:r>
-            <w:r>
-              <w:rPr>
-                <w:b/>
-                <w:bCs/>
-                <w:color w:val="C00000"/>
-                <w:sz w:val="21"/>
-                <w:szCs w:val="21"/>
-              </w:rPr>
-              <w:t>[DATO]%</w:t>
-            </w:r>
-            <w:r>
-              <w:rPr>
-                <w:sz w:val="21"/>
-                <w:szCs w:val="21"/>
-              </w:rPr>
-              <w:t xml:space="preserve"> alto.</w:t>
+              <w:t>reseñas, hay que acumularlas, sostenerlas y convertirlas en una señal visible de confianza para el consumidor.</w:t>
             </w:r>
           </w:p>
         </w:tc>
@@ -5392,6 +4810,7 @@
                 <w:sz w:val="20"/>
                 <w:szCs w:val="20"/>
               </w:rPr>
+              <w:lastRenderedPageBreak/>
               <w:t>VISUAL</w:t>
             </w:r>
           </w:p>
@@ -5422,71 +4841,7 @@
                 <w:sz w:val="21"/>
                 <w:szCs w:val="21"/>
               </w:rPr>
-              <w:t xml:space="preserve">Animación de los ocho componentes del IPO con puntajes: P5 Google </w:t>
-            </w:r>
-            <w:proofErr w:type="spellStart"/>
-            <w:r>
-              <w:rPr>
-                <w:sz w:val="21"/>
-                <w:szCs w:val="21"/>
-              </w:rPr>
-              <w:t>Ads</w:t>
-            </w:r>
-            <w:proofErr w:type="spellEnd"/>
-            <w:r>
-              <w:rPr>
-                <w:sz w:val="21"/>
-                <w:szCs w:val="21"/>
-              </w:rPr>
-              <w:t xml:space="preserve"> (2pt) + P8 canal Google/</w:t>
-            </w:r>
-            <w:proofErr w:type="spellStart"/>
-            <w:r>
-              <w:rPr>
-                <w:sz w:val="21"/>
-                <w:szCs w:val="21"/>
-              </w:rPr>
-              <w:t>Maps</w:t>
-            </w:r>
-            <w:proofErr w:type="spellEnd"/>
-            <w:r>
-              <w:rPr>
-                <w:sz w:val="21"/>
-                <w:szCs w:val="21"/>
-              </w:rPr>
-              <w:t xml:space="preserve"> (2pt) + reseñas Google (3pt) + calificación Google (2pt) + presencia TripAdvisor (1pt) + reseñas TripAdvisor (3pt) + calificación TripAdvisor (2pt) + P13b IA reseñas (3pt) = 18 pts. Captura estilizada de perfiles reales de Google </w:t>
-            </w:r>
-            <w:proofErr w:type="spellStart"/>
-            <w:r>
-              <w:rPr>
-                <w:sz w:val="21"/>
-                <w:szCs w:val="21"/>
-              </w:rPr>
-              <w:t>Maps</w:t>
-            </w:r>
-            <w:proofErr w:type="spellEnd"/>
-            <w:r>
-              <w:rPr>
-                <w:sz w:val="21"/>
-                <w:szCs w:val="21"/>
-              </w:rPr>
-              <w:t xml:space="preserve"> de restaurantes mediterráneos bogotanos. Distribución IPO bajo/medio/alto. Mapa de Bogotá (misma base, ahora coloreado por IPO). </w:t>
-            </w:r>
-            <w:proofErr w:type="spellStart"/>
-            <w:r>
-              <w:rPr>
-                <w:sz w:val="21"/>
-                <w:szCs w:val="21"/>
-              </w:rPr>
-              <w:t>Mini-montaje</w:t>
-            </w:r>
-            <w:proofErr w:type="spellEnd"/>
-            <w:r>
-              <w:rPr>
-                <w:sz w:val="21"/>
-                <w:szCs w:val="21"/>
-              </w:rPr>
-              <w:t xml:space="preserve"> de cierre geográfico: tres mapas en secuencia rápida — IRS → IDL → IPO — para mostrar la consistencia del patrón.</w:t>
+              <w:t>Animación de los ocho componentes del IPO con puntajes: P5 Google Ads (2pt) + P8 canal Google/Maps (2pt) + reseñas Google (3pt) + calificación Google (2pt) + presencia TripAdvisor (1pt) + reseñas TripAdvisor (3pt) + calificación TripAdvisor (2pt) + P13b IA reseñas (3pt) = 18 pts. Captura estilizada de perfiles reales de Google Maps de restaurantes mediterráneos bogotanos. Distribución IPO bajo/medio/alto. Mapa de Bogotá (misma base, ahora coloreado por IPO). Mini-montaje de cierre geográfico: tres mapas en secuencia rápida — IRS → IDL → IPO — para mostrar la consistencia del patrón.</w:t>
             </w:r>
           </w:p>
         </w:tc>
@@ -5551,39 +4906,7 @@
                 <w:sz w:val="21"/>
                 <w:szCs w:val="21"/>
               </w:rPr>
-              <w:t xml:space="preserve">Desglose animado de componentes IPO + capturas reales de Google </w:t>
-            </w:r>
-            <w:proofErr w:type="spellStart"/>
-            <w:r>
-              <w:rPr>
-                <w:sz w:val="21"/>
-                <w:szCs w:val="21"/>
-              </w:rPr>
-              <w:t>Maps</w:t>
-            </w:r>
-            <w:proofErr w:type="spellEnd"/>
-            <w:r>
-              <w:rPr>
-                <w:sz w:val="21"/>
-                <w:szCs w:val="21"/>
-              </w:rPr>
-              <w:t xml:space="preserve"> + tercer mapa de la serie geográfica + </w:t>
-            </w:r>
-            <w:proofErr w:type="spellStart"/>
-            <w:r>
-              <w:rPr>
-                <w:sz w:val="21"/>
-                <w:szCs w:val="21"/>
-              </w:rPr>
-              <w:t>mini-montaje</w:t>
-            </w:r>
-            <w:proofErr w:type="spellEnd"/>
-            <w:r>
-              <w:rPr>
-                <w:sz w:val="21"/>
-                <w:szCs w:val="21"/>
-              </w:rPr>
-              <w:t xml:space="preserve"> de los tres mapas en secuencia.</w:t>
+              <w:t>Desglose animado de componentes IPO + capturas reales de Google Maps + tercer mapa de la serie geográfica + mini-montaje de los tres mapas en secuencia.</w:t>
             </w:r>
           </w:p>
         </w:tc>
@@ -5648,23 +4971,7 @@
                 <w:sz w:val="21"/>
                 <w:szCs w:val="21"/>
               </w:rPr>
-              <w:t xml:space="preserve">El </w:t>
-            </w:r>
-            <w:proofErr w:type="spellStart"/>
-            <w:r>
-              <w:rPr>
-                <w:sz w:val="21"/>
-                <w:szCs w:val="21"/>
-              </w:rPr>
-              <w:t>mini-montaje</w:t>
-            </w:r>
-            <w:proofErr w:type="spellEnd"/>
-            <w:r>
-              <w:rPr>
-                <w:sz w:val="21"/>
-                <w:szCs w:val="21"/>
-              </w:rPr>
-              <w:t xml:space="preserve"> de los tres mapas en secuencia es el remate visual del análisis de índices: muestra que el patrón geográfico es transversal, no accidental. Puede ir acompañado de una frase del narrador: 'En los tres índices, el patrón geográfico aparece.' Énfasis especial en la función de legitimación de las reseñas para el nicho mediterráneo.</w:t>
+              <w:t>El mini-montaje de los tres mapas en secuencia es el remate visual del análisis de índices: muestra que el patrón geográfico es transversal, no accidental. Puede ir acompañado de una frase del narrador: 'En los tres índices, el patrón geográfico aparece.' Énfasis especial en la función de legitimación de las reseñas para el nicho mediterráneo.</w:t>
             </w:r>
           </w:p>
         </w:tc>
@@ -5775,179 +5082,197 @@
                 <w:sz w:val="20"/>
                 <w:szCs w:val="20"/>
               </w:rPr>
+              <w:t>NARRACIÓN</w:t>
+            </w:r>
+          </w:p>
+        </w:tc>
+        <w:tc>
+          <w:tcPr>
+            <w:tcW w:w="7760" w:type="dxa"/>
+            <w:tcBorders>
+              <w:top w:val="single" w:sz="1" w:space="0" w:color="CCCCCC"/>
+              <w:left w:val="single" w:sz="1" w:space="0" w:color="CCCCCC"/>
+              <w:bottom w:val="single" w:sz="1" w:space="0" w:color="CCCCCC"/>
+              <w:right w:val="single" w:sz="1" w:space="0" w:color="CCCCCC"/>
+            </w:tcBorders>
+            <w:tcMar>
+              <w:top w:w="100" w:type="dxa"/>
+              <w:left w:w="160" w:type="dxa"/>
+              <w:bottom w:w="100" w:type="dxa"/>
+              <w:right w:w="160" w:type="dxa"/>
+            </w:tcMar>
+          </w:tcPr>
+          <w:p>
+            <w:pPr>
+              <w:spacing w:line="320" w:lineRule="auto"/>
+              <w:jc w:val="both"/>
+              <w:rPr>
+                <w:sz w:val="21"/>
+                <w:szCs w:val="21"/>
+              </w:rPr>
+            </w:pPr>
+            <w:r>
+              <w:rPr>
+                <w:sz w:val="21"/>
+                <w:szCs w:val="21"/>
+              </w:rPr>
+              <w:t>El análisis no termina en el presente. También quisimos entender cómo los propietarios imaginan el futuro de su posicionamiento y qué lugar le dan a la inteligencia artificial dentro de ese proceso.</w:t>
+            </w:r>
+          </w:p>
+          <w:p>
+            <w:pPr>
+              <w:spacing w:line="320" w:lineRule="auto"/>
+              <w:jc w:val="both"/>
+              <w:rPr>
+                <w:sz w:val="21"/>
+                <w:szCs w:val="21"/>
+              </w:rPr>
+            </w:pPr>
+            <w:r>
+              <w:rPr>
+                <w:sz w:val="21"/>
+                <w:szCs w:val="21"/>
+              </w:rPr>
+              <w:t xml:space="preserve">La IA aparece de forma transversal en el estudio: en redes sociales, como apoyo para crear contenido o automatizar publicaciones; en plataformas de opinión, como posible herramienta para gestionar reseñas; y en la administración cotidiana, a través de herramientas como ChatGPT, Claude, Gemini o Canva AI. De hecho, </w:t>
+            </w:r>
+            <w:r>
+              <w:rPr>
+                <w:b/>
+                <w:bCs/>
+                <w:sz w:val="21"/>
+                <w:szCs w:val="21"/>
+              </w:rPr>
+              <w:t>82,9% de los restaurantes ya usa alguna herramienta de inteligencia artificial</w:t>
+            </w:r>
+            <w:r>
+              <w:rPr>
+                <w:sz w:val="21"/>
+                <w:szCs w:val="21"/>
+              </w:rPr>
+              <w:t>, especialmente aquellas integradas en plataformas como Canva AI o Meta AI.</w:t>
+            </w:r>
+          </w:p>
+          <w:p>
+            <w:pPr>
+              <w:spacing w:line="320" w:lineRule="auto"/>
+              <w:jc w:val="both"/>
+              <w:rPr>
+                <w:sz w:val="21"/>
+                <w:szCs w:val="21"/>
+              </w:rPr>
+            </w:pPr>
+            <w:r>
+              <w:rPr>
+                <w:sz w:val="21"/>
+                <w:szCs w:val="21"/>
+              </w:rPr>
+              <w:t xml:space="preserve">Pero cuando les preguntamos cuál será el factor más determinante para posicionarse en los próximos años, aparece un resultado muy revelador. Solo </w:t>
+            </w:r>
+            <w:r>
+              <w:rPr>
+                <w:b/>
+                <w:bCs/>
+                <w:sz w:val="21"/>
+                <w:szCs w:val="21"/>
+              </w:rPr>
+              <w:t>14,29%</w:t>
+            </w:r>
+            <w:r>
+              <w:rPr>
+                <w:sz w:val="21"/>
+                <w:szCs w:val="21"/>
+              </w:rPr>
+              <w:t xml:space="preserve"> señala la presencia y reputación digital, y apenas </w:t>
+            </w:r>
+            <w:r>
+              <w:rPr>
+                <w:b/>
+                <w:bCs/>
+                <w:sz w:val="21"/>
+                <w:szCs w:val="21"/>
+              </w:rPr>
+              <w:t>8,57%</w:t>
+            </w:r>
+            <w:r>
+              <w:rPr>
+                <w:sz w:val="21"/>
+                <w:szCs w:val="21"/>
+              </w:rPr>
+              <w:t xml:space="preserve"> menciona directamente la adopción de tecnología e inteligencia artificial. En cambio, la mayoría sigue ubicando el posicionamiento en factores más tradicionales: </w:t>
+            </w:r>
+            <w:r>
+              <w:rPr>
+                <w:b/>
+                <w:bCs/>
+                <w:sz w:val="21"/>
+                <w:szCs w:val="21"/>
+              </w:rPr>
+              <w:t>40%</w:t>
+            </w:r>
+            <w:r>
+              <w:rPr>
+                <w:sz w:val="21"/>
+                <w:szCs w:val="21"/>
+              </w:rPr>
+              <w:t xml:space="preserve"> </w:t>
+            </w:r>
+            <w:r>
+              <w:rPr>
+                <w:sz w:val="21"/>
+                <w:szCs w:val="21"/>
+              </w:rPr>
               <w:lastRenderedPageBreak/>
-              <w:t>NARRACIÓN</w:t>
-            </w:r>
-          </w:p>
-        </w:tc>
-        <w:tc>
-          <w:tcPr>
-            <w:tcW w:w="7760" w:type="dxa"/>
-            <w:tcBorders>
-              <w:top w:val="single" w:sz="1" w:space="0" w:color="CCCCCC"/>
-              <w:left w:val="single" w:sz="1" w:space="0" w:color="CCCCCC"/>
-              <w:bottom w:val="single" w:sz="1" w:space="0" w:color="CCCCCC"/>
-              <w:right w:val="single" w:sz="1" w:space="0" w:color="CCCCCC"/>
-            </w:tcBorders>
-            <w:tcMar>
-              <w:top w:w="100" w:type="dxa"/>
-              <w:left w:w="160" w:type="dxa"/>
-              <w:bottom w:w="100" w:type="dxa"/>
-              <w:right w:w="160" w:type="dxa"/>
-            </w:tcMar>
-          </w:tcPr>
-          <w:p>
-            <w:pPr>
-              <w:spacing w:line="320" w:lineRule="auto"/>
-              <w:jc w:val="both"/>
-            </w:pPr>
-            <w:r>
-              <w:rPr>
-                <w:sz w:val="21"/>
-                <w:szCs w:val="21"/>
-              </w:rPr>
-              <w:t xml:space="preserve">El análisis no termina en el presente. Una dimensión adicional del estudio explora cómo los propietarios perciben el rol de la inteligencia artificial en su posicionamiento futuro. La IA ya aparece en los tres índices como variable: en el IRS, como herramienta para generar contenido o automatizar publicaciones; en el IPO, como apoyo para gestionar reseñas. Y transversalmente, también medimos el uso de herramientas como </w:t>
-            </w:r>
-            <w:proofErr w:type="spellStart"/>
-            <w:r>
-              <w:rPr>
-                <w:sz w:val="21"/>
-                <w:szCs w:val="21"/>
-              </w:rPr>
-              <w:t>ChatGPT</w:t>
-            </w:r>
-            <w:proofErr w:type="spellEnd"/>
-            <w:r>
-              <w:rPr>
-                <w:sz w:val="21"/>
-                <w:szCs w:val="21"/>
-              </w:rPr>
-              <w:t>, Claude</w:t>
-            </w:r>
-            <w:r>
-              <w:rPr>
-                <w:sz w:val="21"/>
-                <w:szCs w:val="21"/>
-              </w:rPr>
-              <w:t>,</w:t>
-            </w:r>
-            <w:r>
-              <w:rPr>
-                <w:sz w:val="21"/>
-                <w:szCs w:val="21"/>
-              </w:rPr>
-              <w:t xml:space="preserve"> Gemini </w:t>
-            </w:r>
-            <w:r>
-              <w:rPr>
-                <w:sz w:val="21"/>
-                <w:szCs w:val="21"/>
-              </w:rPr>
-              <w:t xml:space="preserve">o </w:t>
-            </w:r>
-            <w:proofErr w:type="spellStart"/>
-            <w:r>
-              <w:rPr>
-                <w:sz w:val="21"/>
-                <w:szCs w:val="21"/>
-              </w:rPr>
-              <w:t>Canva</w:t>
-            </w:r>
-            <w:proofErr w:type="spellEnd"/>
-            <w:r>
-              <w:rPr>
-                <w:sz w:val="21"/>
-                <w:szCs w:val="21"/>
-              </w:rPr>
-              <w:t xml:space="preserve"> AI </w:t>
-            </w:r>
-            <w:r>
-              <w:rPr>
-                <w:sz w:val="21"/>
-                <w:szCs w:val="21"/>
-              </w:rPr>
-              <w:t>en la administración</w:t>
-            </w:r>
-            <w:r>
-              <w:rPr>
-                <w:sz w:val="21"/>
-                <w:szCs w:val="21"/>
-              </w:rPr>
-              <w:t xml:space="preserve"> de las redes sociales del </w:t>
-            </w:r>
-            <w:r>
-              <w:rPr>
-                <w:sz w:val="21"/>
-                <w:szCs w:val="21"/>
-              </w:rPr>
-              <w:t xml:space="preserve">negocio. </w:t>
-            </w:r>
-            <w:r>
-              <w:rPr>
-                <w:b/>
-                <w:bCs/>
-                <w:color w:val="C00000"/>
-                <w:sz w:val="21"/>
-                <w:szCs w:val="21"/>
-              </w:rPr>
-              <w:t>[DATO]%</w:t>
-            </w:r>
-            <w:r>
-              <w:rPr>
-                <w:sz w:val="21"/>
-                <w:szCs w:val="21"/>
-              </w:rPr>
-              <w:t xml:space="preserve"> ya usa alguna herramienta de IA. La aplicación que más les interesaría adoptar es </w:t>
-            </w:r>
-            <w:r>
-              <w:rPr>
-                <w:b/>
-                <w:bCs/>
-                <w:color w:val="C00000"/>
-                <w:sz w:val="21"/>
-                <w:szCs w:val="21"/>
-              </w:rPr>
-              <w:t>[DATO]</w:t>
-            </w:r>
-            <w:r>
-              <w:rPr>
-                <w:sz w:val="21"/>
-                <w:szCs w:val="21"/>
-              </w:rPr>
-              <w:t xml:space="preserve">. Y cuando se les pregunta qué factor consideran más determinante para su posicionamiento en los próximos años, </w:t>
-            </w:r>
-            <w:r>
-              <w:rPr>
-                <w:b/>
-                <w:bCs/>
-                <w:color w:val="C00000"/>
-                <w:sz w:val="21"/>
-                <w:szCs w:val="21"/>
-              </w:rPr>
-              <w:t>[DATO]%</w:t>
-            </w:r>
-            <w:r>
-              <w:rPr>
-                <w:sz w:val="21"/>
-                <w:szCs w:val="21"/>
-              </w:rPr>
-              <w:t xml:space="preserve"> señala la presencia y reputación digital. La intención existe. </w:t>
-            </w:r>
-            <w:r>
-              <w:rPr>
-                <w:b/>
-                <w:bCs/>
-                <w:sz w:val="21"/>
-                <w:szCs w:val="21"/>
-              </w:rPr>
-              <w:t>La adopción, todavía va rezagada</w:t>
-            </w:r>
-            <w:r>
-              <w:rPr>
-                <w:sz w:val="21"/>
-                <w:szCs w:val="21"/>
-              </w:rPr>
-              <w:t>. Esa brecha —entre lo que los propietarios reconocen que necesitan y lo que efectivamente implementan— es quizás la señal más relevante de hacia dónde va el nicho.</w:t>
+              <w:t xml:space="preserve">menciona la calidad y autenticidad del producto, y </w:t>
+            </w:r>
+            <w:r>
+              <w:rPr>
+                <w:b/>
+                <w:bCs/>
+                <w:sz w:val="21"/>
+                <w:szCs w:val="21"/>
+              </w:rPr>
+              <w:t>34,29%</w:t>
+            </w:r>
+            <w:r>
+              <w:rPr>
+                <w:sz w:val="21"/>
+                <w:szCs w:val="21"/>
+              </w:rPr>
+              <w:t xml:space="preserve"> la experiencia y el ambiente del local.</w:t>
+            </w:r>
+          </w:p>
+          <w:p>
+            <w:pPr>
+              <w:spacing w:line="320" w:lineRule="auto"/>
+              <w:jc w:val="both"/>
+              <w:rPr>
+                <w:sz w:val="21"/>
+                <w:szCs w:val="21"/>
+              </w:rPr>
+            </w:pPr>
+            <w:r>
+              <w:rPr>
+                <w:sz w:val="21"/>
+                <w:szCs w:val="21"/>
+              </w:rPr>
+              <w:t>Esto muestra que todavía no hay un cambio de paradigma completamente claro dentro del nicho. Los restaurantes ya están usando herramientas digitales e incluso IA, pero no necesariamente las entienden como el centro de su estrategia competitiva futura. Para la mayoría, posicionarse sigue significando cocinar bien, ofrecer una experiencia auténtica y construir una relación presencial con el cliente.</w:t>
+            </w:r>
+          </w:p>
+          <w:p>
+            <w:pPr>
+              <w:spacing w:line="320" w:lineRule="auto"/>
+              <w:jc w:val="both"/>
+              <w:rPr>
+                <w:sz w:val="21"/>
+                <w:szCs w:val="21"/>
+              </w:rPr>
+            </w:pPr>
+            <w:r>
+              <w:rPr>
+                <w:sz w:val="21"/>
+                <w:szCs w:val="21"/>
+              </w:rPr>
+              <w:t>La señal interesante está justamente en esa tensión: el mercado se mueve hacia plataformas, reseñas, algoritmos e inteligencia artificial, pero muchos propietarios todavía interpretan la ventaja competitiva desde la calidad del producto y la experiencia en el local. Ahí aparece una brecha clave entre adopción tecnológica y visión estratégica.</w:t>
             </w:r>
           </w:p>
         </w:tc>
@@ -5982,6 +5307,7 @@
                 <w:sz w:val="20"/>
                 <w:szCs w:val="20"/>
               </w:rPr>
+              <w:lastRenderedPageBreak/>
               <w:t>VISUAL</w:t>
             </w:r>
           </w:p>
@@ -6309,50 +5635,14 @@
                 <w:sz w:val="21"/>
                 <w:szCs w:val="21"/>
               </w:rPr>
-              <w:t xml:space="preserve">Lo que el estudio muestra con mayor claridad es que la combinación coherente de los tres ejes — reseñas, redes y </w:t>
-            </w:r>
-            <w:proofErr w:type="spellStart"/>
-            <w:r>
-              <w:rPr>
-                <w:b/>
-                <w:bCs/>
-                <w:sz w:val="21"/>
-                <w:szCs w:val="21"/>
-              </w:rPr>
-              <w:t>delivery</w:t>
-            </w:r>
-            <w:proofErr w:type="spellEnd"/>
-            <w:r>
-              <w:rPr>
-                <w:b/>
-                <w:bCs/>
-                <w:sz w:val="21"/>
-                <w:szCs w:val="21"/>
-              </w:rPr>
-              <w:t xml:space="preserve"> — genera un posicionamiento digital que ninguno de los tres produce por sí solo.</w:t>
-            </w:r>
-            <w:r>
-              <w:rPr>
-                <w:sz w:val="21"/>
-                <w:szCs w:val="21"/>
-              </w:rPr>
-              <w:t xml:space="preserve"> Estar en </w:t>
-            </w:r>
-            <w:proofErr w:type="spellStart"/>
-            <w:r>
-              <w:rPr>
-                <w:sz w:val="21"/>
-                <w:szCs w:val="21"/>
-              </w:rPr>
-              <w:t>Rappi</w:t>
-            </w:r>
-            <w:proofErr w:type="spellEnd"/>
-            <w:r>
-              <w:rPr>
-                <w:sz w:val="21"/>
-                <w:szCs w:val="21"/>
-              </w:rPr>
-              <w:t xml:space="preserve"> sin gestionar las reseñas no cierra el ciclo. Tener Instagram activo sin datos de comportamiento tampoco. La evolución de la presencia digital en este nicho no es una línea recta — es la construcción progresiva de una reputación que el consumidor puede encontrar, leer y creer. Los restaurantes </w:t>
+              <w:t>Lo que el estudio muestra con mayor claridad es que la combinación coherente de los tres ejes — reseñas, redes y delivery — genera un posicionamiento digital que ninguno de los tres produce por sí solo.</w:t>
+            </w:r>
+            <w:r>
+              <w:rPr>
+                <w:sz w:val="21"/>
+                <w:szCs w:val="21"/>
+              </w:rPr>
+              <w:t xml:space="preserve"> Estar en Rappi sin gestionar las reseñas no cierra el ciclo. Tener Instagram activo sin datos de comportamiento tampoco. La evolución de la presencia digital en este nicho no es una línea recta — es la construcción progresiva de una reputación que el consumidor puede encontrar, leer y creer. Los restaurantes que están avanzando en ese proceso son los que ya entienden que el digital no </w:t>
             </w:r>
             <w:r>
               <w:rPr>
@@ -6360,7 +5650,7 @@
                 <w:szCs w:val="21"/>
               </w:rPr>
               <w:lastRenderedPageBreak/>
-              <w:t xml:space="preserve">que están avanzando en ese proceso son los que ya entienden que el digital no es un canal más: </w:t>
+              <w:t xml:space="preserve">es un canal más: </w:t>
             </w:r>
             <w:r>
               <w:rPr>
@@ -6572,23 +5862,7 @@
                 <w:sz w:val="21"/>
                 <w:szCs w:val="21"/>
               </w:rPr>
-              <w:t xml:space="preserve">Ritmo más lento y reflexivo en los últimos 30 segundos. La frase 'el digital no es un canal más: es el mercado' es el punto de inflexión emocional del cierre — pausa breve antes. La última frase sobre 'una ciudad que decide con el teléfono en la mano' es el remate: música sube muy suavemente, luego </w:t>
-            </w:r>
-            <w:proofErr w:type="spellStart"/>
-            <w:r>
-              <w:rPr>
-                <w:sz w:val="21"/>
-                <w:szCs w:val="21"/>
-              </w:rPr>
-              <w:t>fade</w:t>
-            </w:r>
-            <w:proofErr w:type="spellEnd"/>
-            <w:r>
-              <w:rPr>
-                <w:sz w:val="21"/>
-                <w:szCs w:val="21"/>
-              </w:rPr>
-              <w:t xml:space="preserve"> a silencio antes del plano institucional.</w:t>
+              <w:t>Ritmo más lento y reflexivo en los últimos 30 segundos. La frase 'el digital no es un canal más: es el mercado' es el punto de inflexión emocional del cierre — pausa breve antes. La última frase sobre 'una ciudad que decide con el teléfono en la mano' es el remate: música sube muy suavemente, luego fade a silencio antes del plano institucional.</w:t>
             </w:r>
           </w:p>
         </w:tc>
@@ -7161,7 +6435,7 @@
     <w:name w:val="Normal"/>
     <w:qFormat/>
   </w:style>
-  <w:style w:type="paragraph" w:styleId="Ttulo1">
+  <w:style w:type="paragraph" w:styleId="Heading1">
     <w:name w:val="heading 1"/>
     <w:uiPriority w:val="9"/>
     <w:qFormat/>
@@ -7177,7 +6451,7 @@
       <w:szCs w:val="32"/>
     </w:rPr>
   </w:style>
-  <w:style w:type="paragraph" w:styleId="Ttulo2">
+  <w:style w:type="paragraph" w:styleId="Heading2">
     <w:name w:val="heading 2"/>
     <w:uiPriority w:val="9"/>
     <w:semiHidden/>
@@ -7195,7 +6469,7 @@
       <w:szCs w:val="26"/>
     </w:rPr>
   </w:style>
-  <w:style w:type="paragraph" w:styleId="Ttulo3">
+  <w:style w:type="paragraph" w:styleId="Heading3">
     <w:name w:val="heading 3"/>
     <w:uiPriority w:val="9"/>
     <w:semiHidden/>
@@ -7210,7 +6484,7 @@
       <w:szCs w:val="24"/>
     </w:rPr>
   </w:style>
-  <w:style w:type="paragraph" w:styleId="Ttulo4">
+  <w:style w:type="paragraph" w:styleId="Heading4">
     <w:name w:val="heading 4"/>
     <w:uiPriority w:val="9"/>
     <w:semiHidden/>
@@ -7225,7 +6499,7 @@
       <w:color w:val="2E74B5"/>
     </w:rPr>
   </w:style>
-  <w:style w:type="paragraph" w:styleId="Ttulo5">
+  <w:style w:type="paragraph" w:styleId="Heading5">
     <w:name w:val="heading 5"/>
     <w:uiPriority w:val="9"/>
     <w:semiHidden/>
@@ -7238,7 +6512,7 @@
       <w:color w:val="2E74B5"/>
     </w:rPr>
   </w:style>
-  <w:style w:type="paragraph" w:styleId="Ttulo6">
+  <w:style w:type="paragraph" w:styleId="Heading6">
     <w:name w:val="heading 6"/>
     <w:uiPriority w:val="9"/>
     <w:semiHidden/>
@@ -7251,12 +6525,12 @@
       <w:color w:val="1F4D78"/>
     </w:rPr>
   </w:style>
-  <w:style w:type="character" w:default="1" w:styleId="Fuentedeprrafopredeter">
+  <w:style w:type="character" w:default="1" w:styleId="DefaultParagraphFont">
     <w:name w:val="Default Paragraph Font"/>
     <w:uiPriority w:val="1"/>
     <w:unhideWhenUsed/>
   </w:style>
-  <w:style w:type="table" w:default="1" w:styleId="Tablanormal">
+  <w:style w:type="table" w:default="1" w:styleId="TableNormal">
     <w:name w:val="Normal Table"/>
     <w:uiPriority w:val="99"/>
     <w:semiHidden/>
@@ -7271,13 +6545,13 @@
       </w:tblCellMar>
     </w:tblPr>
   </w:style>
-  <w:style w:type="numbering" w:default="1" w:styleId="Sinlista">
+  <w:style w:type="numbering" w:default="1" w:styleId="NoList">
     <w:name w:val="No List"/>
     <w:uiPriority w:val="99"/>
     <w:semiHidden/>
     <w:unhideWhenUsed/>
   </w:style>
-  <w:style w:type="paragraph" w:styleId="Ttulo">
+  <w:style w:type="paragraph" w:styleId="Title">
     <w:name w:val="Title"/>
     <w:uiPriority w:val="10"/>
     <w:qFormat/>
@@ -7294,11 +6568,11 @@
       <w:bCs/>
     </w:rPr>
   </w:style>
-  <w:style w:type="paragraph" w:styleId="Prrafodelista">
+  <w:style w:type="paragraph" w:styleId="ListParagraph">
     <w:name w:val="List Paragraph"/>
     <w:qFormat/>
   </w:style>
-  <w:style w:type="character" w:styleId="Hipervnculo">
+  <w:style w:type="character" w:styleId="Hyperlink">
     <w:name w:val="Hyperlink"/>
     <w:uiPriority w:val="99"/>
     <w:unhideWhenUsed/>
@@ -7307,7 +6581,7 @@
       <w:u w:val="single"/>
     </w:rPr>
   </w:style>
-  <w:style w:type="character" w:styleId="Refdenotaalpie">
+  <w:style w:type="character" w:styleId="FootnoteReference">
     <w:name w:val="footnote reference"/>
     <w:uiPriority w:val="99"/>
     <w:semiHidden/>
@@ -7316,9 +6590,9 @@
       <w:vertAlign w:val="superscript"/>
     </w:rPr>
   </w:style>
-  <w:style w:type="paragraph" w:styleId="Textonotapie">
+  <w:style w:type="paragraph" w:styleId="FootnoteText">
     <w:name w:val="footnote text"/>
-    <w:link w:val="TextonotapieCar"/>
+    <w:link w:val="FootnoteTextChar"/>
     <w:uiPriority w:val="99"/>
     <w:semiHidden/>
     <w:unhideWhenUsed/>
@@ -7327,9 +6601,9 @@
       <w:szCs w:val="20"/>
     </w:rPr>
   </w:style>
-  <w:style w:type="character" w:customStyle="1" w:styleId="TextonotapieCar">
-    <w:name w:val="Texto nota pie Car"/>
-    <w:link w:val="Textonotapie"/>
+  <w:style w:type="character" w:customStyle="1" w:styleId="FootnoteTextChar">
+    <w:name w:val="Footnote Text Char"/>
+    <w:link w:val="FootnoteText"/>
     <w:uiPriority w:val="99"/>
     <w:semiHidden/>
     <w:unhideWhenUsed/>
@@ -7338,7 +6612,7 @@
       <w:szCs w:val="20"/>
     </w:rPr>
   </w:style>
-  <w:style w:type="character" w:styleId="Refdenotaalfinal">
+  <w:style w:type="character" w:styleId="EndnoteReference">
     <w:name w:val="endnote reference"/>
     <w:uiPriority w:val="99"/>
     <w:semiHidden/>
@@ -7347,9 +6621,9 @@
       <w:vertAlign w:val="superscript"/>
     </w:rPr>
   </w:style>
-  <w:style w:type="paragraph" w:styleId="Textonotaalfinal">
+  <w:style w:type="paragraph" w:styleId="EndnoteText">
     <w:name w:val="endnote text"/>
-    <w:link w:val="TextonotaalfinalCar"/>
+    <w:link w:val="EndnoteTextChar"/>
     <w:uiPriority w:val="99"/>
     <w:semiHidden/>
     <w:unhideWhenUsed/>
@@ -7358,9 +6632,9 @@
       <w:szCs w:val="20"/>
     </w:rPr>
   </w:style>
-  <w:style w:type="character" w:customStyle="1" w:styleId="TextonotaalfinalCar">
-    <w:name w:val="Texto nota al final Car"/>
-    <w:link w:val="Textonotaalfinal"/>
+  <w:style w:type="character" w:customStyle="1" w:styleId="EndnoteTextChar">
+    <w:name w:val="Endnote Text Char"/>
+    <w:link w:val="EndnoteText"/>
     <w:uiPriority w:val="99"/>
     <w:semiHidden/>
     <w:unhideWhenUsed/>

</xml_diff>